<commit_message>
Added Seeder for testing and update migration and models
</commit_message>
<xml_diff>
--- a/backend/storage/app/templates/attestation_travail.docx
+++ b/backend/storage/app/templates/attestation_travail.docx
@@ -1,8 +1,8 @@
 
 <file path=word/document.xml><?xml version="1.0" encoding="utf-8"?>
-<w:document xmlns:wpc="http://schemas.microsoft.com/office/word/2010/wordprocessingCanvas" xmlns:mc="http://schemas.openxmlformats.org/markup-compatibility/2006" xmlns:o="urn:schemas-microsoft-com:office:office" xmlns:r="http://schemas.openxmlformats.org/officeDocument/2006/relationships" xmlns:m="http://schemas.openxmlformats.org/officeDocument/2006/math" xmlns:v="urn:schemas-microsoft-com:vml" xmlns:wp14="http://schemas.microsoft.com/office/word/2010/wordprocessingDrawing" xmlns:wp="http://schemas.openxmlformats.org/drawingml/2006/wordprocessingDrawing" xmlns:w10="urn:schemas-microsoft-com:office:word" xmlns:w="http://schemas.openxmlformats.org/wordprocessingml/2006/main" xmlns:w14="http://schemas.microsoft.com/office/word/2010/wordml" xmlns:w15="http://schemas.microsoft.com/office/word/2012/wordml" xmlns:wpg="http://schemas.microsoft.com/office/word/2010/wordprocessingGroup" xmlns:wpi="http://schemas.microsoft.com/office/word/2010/wordprocessingInk" xmlns:wne="http://schemas.microsoft.com/office/word/2006/wordml" xmlns:wps="http://schemas.microsoft.com/office/word/2010/wordprocessingShape" xmlns:w16se="http://schemas.microsoft.com/office/word/2015/wordml/symex" xmlns:w16cid="http://schemas.microsoft.com/office/word/2016/wordml/cid" xmlns:w16="http://schemas.microsoft.com/office/word/2018/wordml" xmlns:w16cex="http://schemas.microsoft.com/office/word/2018/wordml/cex" xmlns:w16sdtdh="http://schemas.microsoft.com/office/word/2020/wordml/sdtdatahash" xmlns:w16sdtfl="http://schemas.microsoft.com/office/word/2024/wordml/sdtformatlock" xmlns:a="http://schemas.openxmlformats.org/drawingml/2006/main" xmlns:pic="http://schemas.openxmlformats.org/drawingml/2006/picture" xmlns:a14="http://schemas.microsoft.com/office/drawing/2010/main" mc:Ignorable="w14 w15 wp14 w16se w16cid w16 w16cex w16sdtdh w16sdtfl">
+<w:document xmlns:wpc="http://schemas.microsoft.com/office/word/2010/wordprocessingCanvas" xmlns:mc="http://schemas.openxmlformats.org/markup-compatibility/2006" xmlns:o="urn:schemas-microsoft-com:office:office" xmlns:r="http://schemas.openxmlformats.org/officeDocument/2006/relationships" xmlns:m="http://schemas.openxmlformats.org/officeDocument/2006/math" xmlns:v="urn:schemas-microsoft-com:vml" xmlns:wp14="http://schemas.microsoft.com/office/word/2010/wordprocessingDrawing" xmlns:wp="http://schemas.openxmlformats.org/drawingml/2006/wordprocessingDrawing" xmlns:w10="urn:schemas-microsoft-com:office:word" xmlns:w="http://schemas.openxmlformats.org/wordprocessingml/2006/main" xmlns:w14="http://schemas.microsoft.com/office/word/2010/wordml" xmlns:w15="http://schemas.microsoft.com/office/word/2012/wordml" xmlns:w16se="http://schemas.microsoft.com/office/word/2015/wordml/symex" xmlns:w16cid="http://schemas.microsoft.com/office/word/2016/wordml/cid" xmlns:w16="http://schemas.microsoft.com/office/word/2018/wordml" xmlns:w16cex="http://schemas.microsoft.com/office/word/2018/wordml/cex" xmlns:w16sdtdh="http://schemas.microsoft.com/office/word/2020/wordml/sdtdatahash" xmlns:wne="http://schemas.microsoft.com/office/word/2006/wordml" xmlns:wpg="http://schemas.microsoft.com/office/word/2010/wordprocessingGroup" xmlns:wps="http://schemas.microsoft.com/office/word/2010/wordprocessingShape" mc:Ignorable="w14 w15 w16se w16cid w16 w16cex w16sdtdh wp14">
   <w:body>
-    <w:p xmlns:wp14="http://schemas.microsoft.com/office/word/2010/wordml" wp14:paraId="6AFA6743" wp14:textId="50A37661">
+    <w:p>
       <w:pPr>
         <w:pStyle w:val="Normal"/>
         <w:spacing w:after="0" w:line="240" w:lineRule="auto"/>
@@ -10,7 +10,7 @@
       </w:pPr>
       <w:r>
         <w:drawing>
-          <wp:anchor xmlns:wp14="http://schemas.microsoft.com/office/word/2010/wordprocessingDrawing" distT="0" distB="0" distL="114300" distR="114300" simplePos="0" relativeHeight="251658240" behindDoc="0" locked="0" layoutInCell="1" allowOverlap="1" wp14:anchorId="1FBB6C2B" wp14:editId="2EA04A3E">
+          <wp:anchor distT="0" distB="0" distL="114300" distR="114300" simplePos="0" relativeHeight="251658240" behindDoc="0" locked="0" layoutInCell="1" allowOverlap="1">
             <wp:simplePos x="0" y="0"/>
             <wp:positionH relativeFrom="column">
               <wp:posOffset>4648200</wp:posOffset>
@@ -21,25 +21,19 @@
             <wp:extent cx="723900" cy="571500"/>
             <wp:effectExtent l="0" t="0" r="0" b="0"/>
             <wp:wrapNone/>
-            <wp:docPr id="1334480110" name="drawing"/>
+            <wp:docPr id="100000" name="Picture 100000"/>
             <wp:cNvGraphicFramePr>
-              <a:graphicFrameLocks noChangeAspect="1"/>
+              <a:graphicFrameLocks xmlns:a="http://schemas.openxmlformats.org/drawingml/2006/main" noChangeAspect="1"/>
             </wp:cNvGraphicFramePr>
-            <a:graphic>
-              <a:graphicData xmlns:a="http://schemas.openxmlformats.org/drawingml/2006/main" uri="http://schemas.openxmlformats.org/drawingml/2006/picture">
+            <a:graphic xmlns:a="http://schemas.openxmlformats.org/drawingml/2006/main">
+              <a:graphicData uri="http://schemas.openxmlformats.org/drawingml/2006/picture">
                 <pic:pic xmlns:pic="http://schemas.openxmlformats.org/drawingml/2006/picture">
                   <pic:nvPicPr>
-                    <pic:cNvPr id="501944396" name="Picture 501944396"/>
+                    <pic:cNvPr id="100000" name="image100000"/>
                     <pic:cNvPicPr/>
                   </pic:nvPicPr>
                   <pic:blipFill>
-                    <a:blip xmlns:r="http://schemas.openxmlformats.org/officeDocument/2006/relationships" r:embed="rId605774525">
-                      <a:extLst>
-                        <a:ext uri="{28A0092B-C50C-407E-A947-70E740481C1C}">
-                          <a14:useLocalDpi xmlns:a14="http://schemas.microsoft.com/office/drawing/2010/main"/>
-                        </a:ext>
-                      </a:extLst>
-                    </a:blip>
+                    <a:blip r:embed="rId605774525"/>
                     <a:stretch>
                       <a:fillRect/>
                     </a:stretch>
@@ -56,18 +50,12 @@
                 </pic:pic>
               </a:graphicData>
             </a:graphic>
-            <wp14:sizeRelH relativeFrom="page">
-              <wp14:pctWidth>0</wp14:pctWidth>
-            </wp14:sizeRelH>
-            <wp14:sizeRelV relativeFrom="page">
-              <wp14:pctHeight>0</wp14:pctHeight>
-            </wp14:sizeRelV>
           </wp:anchor>
         </w:drawing>
       </w:r>
       <w:r>
         <w:drawing>
-          <wp:anchor xmlns:wp14="http://schemas.microsoft.com/office/word/2010/wordprocessingDrawing" distT="0" distB="0" distL="114300" distR="114300" simplePos="0" relativeHeight="251658240" behindDoc="0" locked="0" layoutInCell="1" allowOverlap="1" wp14:anchorId="481C8BFA" wp14:editId="78FA39E8">
+          <wp:anchor distT="0" distB="0" distL="114300" distR="114300" simplePos="0" relativeHeight="251658240" behindDoc="0" locked="0" layoutInCell="1" allowOverlap="1">
             <wp:simplePos x="0" y="0"/>
             <wp:positionH relativeFrom="column">
               <wp:posOffset>-47625</wp:posOffset>
@@ -78,25 +66,19 @@
             <wp:extent cx="2038350" cy="628650"/>
             <wp:effectExtent l="0" t="0" r="0" b="0"/>
             <wp:wrapNone/>
-            <wp:docPr id="922366770" name="drawing"/>
+            <wp:docPr id="100001" name="Picture 100001"/>
             <wp:cNvGraphicFramePr>
-              <a:graphicFrameLocks noChangeAspect="1"/>
+              <a:graphicFrameLocks xmlns:a="http://schemas.openxmlformats.org/drawingml/2006/main" noChangeAspect="1"/>
             </wp:cNvGraphicFramePr>
-            <a:graphic>
-              <a:graphicData xmlns:a="http://schemas.openxmlformats.org/drawingml/2006/main" uri="http://schemas.openxmlformats.org/drawingml/2006/picture">
+            <a:graphic xmlns:a="http://schemas.openxmlformats.org/drawingml/2006/main">
+              <a:graphicData uri="http://schemas.openxmlformats.org/drawingml/2006/picture">
                 <pic:pic xmlns:pic="http://schemas.openxmlformats.org/drawingml/2006/picture">
                   <pic:nvPicPr>
-                    <pic:cNvPr id="1386879043" name="Picture 1386879043"/>
+                    <pic:cNvPr id="100001" name="image100001"/>
                     <pic:cNvPicPr/>
                   </pic:nvPicPr>
                   <pic:blipFill>
-                    <a:blip xmlns:r="http://schemas.openxmlformats.org/officeDocument/2006/relationships" r:embed="rId1927491159">
-                      <a:extLst>
-                        <a:ext uri="{28A0092B-C50C-407E-A947-70E740481C1C}">
-                          <a14:useLocalDpi xmlns:a14="http://schemas.microsoft.com/office/drawing/2010/main"/>
-                        </a:ext>
-                      </a:extLst>
-                    </a:blip>
+                    <a:blip r:embed="rId1927491159"/>
                     <a:stretch>
                       <a:fillRect/>
                     </a:stretch>
@@ -113,83 +95,57 @@
                 </pic:pic>
               </a:graphicData>
             </a:graphic>
-            <wp14:sizeRelH relativeFrom="page">
-              <wp14:pctWidth>0</wp14:pctWidth>
-            </wp14:sizeRelH>
-            <wp14:sizeRelV relativeFrom="page">
-              <wp14:pctHeight>0</wp14:pctHeight>
-            </wp14:sizeRelV>
           </wp:anchor>
         </w:drawing>
       </w:r>
     </w:p>
-    <w:p xmlns:wp14="http://schemas.microsoft.com/office/word/2010/wordml" wp14:paraId="6F1DD99A" wp14:textId="35B0A013">
-      <w:pPr>
-        <w:spacing w:after="0" w:line="240" w:lineRule="auto"/>
-        <w:rPr>
-          <w:rFonts w:ascii="Gill Sans MT" w:hAnsi="Gill Sans MT" w:eastAsia="Gill Sans MT" w:cs="Gill Sans MT"/>
-          <w:b w:val="0"/>
-          <w:bCs w:val="0"/>
-          <w:i w:val="0"/>
-          <w:iCs w:val="0"/>
-          <w:caps w:val="0"/>
-          <w:smallCaps w:val="0"/>
-          <w:noProof w:val="0"/>
+    <w:p>
+      <w:pPr>
+        <w:spacing w:after="0" w:line="240" w:lineRule="auto"/>
+        <w:rPr>
+          <w:rFonts w:ascii="Gill Sans MT" w:hAnsi="Gill Sans MT" w:eastAsia="Gill Sans MT" w:cs="Gill Sans MT"/>
+          <w:b w:val="0"/>
+          <w:bCs w:val="0"/>
+          <w:i w:val="0"/>
+          <w:iCs w:val="0"/>
+          <w:caps w:val="0"/>
+          <w:smallCaps w:val="0"/>
           <w:color w:val="000000" w:themeColor="text1" w:themeTint="FF" w:themeShade="FF"/>
           <w:sz w:val="24"/>
           <w:szCs w:val="24"/>
-          <w:lang w:val="en-US"/>
-        </w:rPr>
-      </w:pPr>
-      <w:r>
-        <w:rPr>
-          <w:rFonts w:ascii="Gill Sans MT" w:hAnsi="Gill Sans MT" w:eastAsia="Gill Sans MT" w:cs="Gill Sans MT"/>
-          <w:b w:val="0"/>
-          <w:bCs w:val="0"/>
-          <w:i w:val="1"/>
-          <w:iCs w:val="1"/>
-          <w:caps w:val="0"/>
-          <w:smallCaps w:val="0"/>
-          <w:noProof w:val="0"/>
+        </w:rPr>
+      </w:pPr>
+      <w:r>
+        <w:rPr>
+          <w:rFonts w:ascii="Gill Sans MT" w:hAnsi="Gill Sans MT" w:eastAsia="Gill Sans MT" w:cs="Gill Sans MT"/>
+          <w:i/>
+          <w:iCs/>
           <w:color w:val="000000" w:themeColor="text1" w:themeTint="FF" w:themeShade="FF"/>
           <w:sz w:val="24"/>
           <w:szCs w:val="24"/>
-          <w:lang w:val="fr-FR"/>
         </w:rPr>
         <w:t xml:space="preserve">Réf : OFP/DRBMK/CMCBMK-AT/N° </w:t>
       </w:r>
       <w:r>
         <w:rPr>
           <w:rFonts w:ascii="Gill Sans MT" w:hAnsi="Gill Sans MT" w:eastAsia="Gill Sans MT" w:cs="Gill Sans MT"/>
-          <w:b w:val="0"/>
-          <w:bCs w:val="0"/>
-          <w:i w:val="1"/>
-          <w:iCs w:val="1"/>
-          <w:caps w:val="0"/>
-          <w:smallCaps w:val="0"/>
-          <w:noProof w:val="0"/>
+          <w:i/>
+          <w:iCs/>
           <w:color w:val="000000" w:themeColor="text1" w:themeTint="FF" w:themeShade="FF"/>
           <w:sz w:val="24"/>
           <w:szCs w:val="24"/>
           <w:highlight w:val="yellow"/>
-          <w:lang w:val="fr-FR"/>
-        </w:rPr>
-        <w:t>28</w:t>
-      </w:r>
-      <w:r>
-        <w:rPr>
-          <w:rFonts w:ascii="Gill Sans MT" w:hAnsi="Gill Sans MT" w:eastAsia="Gill Sans MT" w:cs="Gill Sans MT"/>
-          <w:b w:val="0"/>
-          <w:bCs w:val="0"/>
-          <w:i w:val="1"/>
-          <w:iCs w:val="1"/>
-          <w:caps w:val="0"/>
-          <w:smallCaps w:val="0"/>
-          <w:noProof w:val="0"/>
+        </w:rPr>
+        <w:t>${ref}</w:t>
+      </w:r>
+      <w:r>
+        <w:rPr>
+          <w:rFonts w:ascii="Gill Sans MT" w:hAnsi="Gill Sans MT" w:eastAsia="Gill Sans MT" w:cs="Gill Sans MT"/>
+          <w:i/>
+          <w:iCs/>
           <w:color w:val="000000" w:themeColor="text1" w:themeTint="FF" w:themeShade="FF"/>
           <w:sz w:val="24"/>
           <w:szCs w:val="24"/>
-          <w:lang w:val="fr-FR"/>
         </w:rPr>
         <w:t>/26</w:t>
       </w:r>
@@ -202,22 +158,16 @@
       <w:r>
         <w:rPr>
           <w:rFonts w:ascii="Gill Sans MT" w:hAnsi="Gill Sans MT" w:eastAsia="Gill Sans MT" w:cs="Gill Sans MT"/>
-          <w:b w:val="0"/>
-          <w:bCs w:val="0"/>
-          <w:i w:val="1"/>
-          <w:iCs w:val="1"/>
-          <w:caps w:val="0"/>
-          <w:smallCaps w:val="0"/>
-          <w:noProof w:val="0"/>
+          <w:i/>
+          <w:iCs/>
           <w:color w:val="000000" w:themeColor="text1" w:themeTint="FF" w:themeShade="FF"/>
           <w:sz w:val="24"/>
           <w:szCs w:val="24"/>
-          <w:lang w:val="fr-FR"/>
-        </w:rPr>
-        <w:t xml:space="preserve">                                   Béni Mellal, le 09/04/2026</w:t>
-      </w:r>
-    </w:p>
-    <w:p xmlns:wp14="http://schemas.microsoft.com/office/word/2010/wordml" wp14:paraId="78962628" wp14:textId="28D03F37">
+        </w:rPr>
+        <w:t xml:space="preserve">                                   Béni Mellal, le${current_date}</w:t>
+      </w:r>
+    </w:p>
+    <w:p>
       <w:pPr>
         <w:spacing w:after="0" w:line="240" w:lineRule="auto"/>
         <w:ind w:left="426"/>
@@ -229,15 +179,13 @@
           <w:iCs w:val="0"/>
           <w:caps w:val="0"/>
           <w:smallCaps w:val="0"/>
-          <w:noProof w:val="0"/>
           <w:color w:val="000000" w:themeColor="text1" w:themeTint="FF" w:themeShade="FF"/>
           <w:sz w:val="32"/>
           <w:szCs w:val="32"/>
-          <w:lang w:val="en-US"/>
-        </w:rPr>
-      </w:pPr>
-    </w:p>
-    <w:p xmlns:wp14="http://schemas.microsoft.com/office/word/2010/wordml" wp14:paraId="24C1B9E8" wp14:textId="3771F2AC">
+        </w:rPr>
+      </w:pPr>
+    </w:p>
+    <w:p>
       <w:pPr>
         <w:spacing w:after="0" w:line="240" w:lineRule="auto"/>
         <w:ind w:left="426"/>
@@ -249,15 +197,13 @@
           <w:iCs w:val="0"/>
           <w:caps w:val="0"/>
           <w:smallCaps w:val="0"/>
-          <w:noProof w:val="0"/>
           <w:color w:val="000000" w:themeColor="text1" w:themeTint="FF" w:themeShade="FF"/>
           <w:sz w:val="32"/>
           <w:szCs w:val="32"/>
-          <w:lang w:val="en-US"/>
-        </w:rPr>
-      </w:pPr>
-    </w:p>
-    <w:p xmlns:wp14="http://schemas.microsoft.com/office/word/2010/wordml" wp14:paraId="0998E056" wp14:textId="495B37BF">
+        </w:rPr>
+      </w:pPr>
+    </w:p>
+    <w:p>
       <w:pPr>
         <w:spacing w:after="0" w:line="240" w:lineRule="auto"/>
         <w:ind w:left="426"/>
@@ -269,18 +215,16 @@
           <w:iCs w:val="0"/>
           <w:caps w:val="0"/>
           <w:smallCaps w:val="0"/>
-          <w:noProof w:val="0"/>
           <w:color w:val="000000" w:themeColor="text1" w:themeTint="FF" w:themeShade="FF"/>
           <w:sz w:val="32"/>
           <w:szCs w:val="32"/>
-          <w:lang w:val="en-US"/>
-        </w:rPr>
-      </w:pPr>
-    </w:p>
-    <w:p xmlns:wp14="http://schemas.microsoft.com/office/word/2010/wordml" wp14:paraId="7D7DEE6A" wp14:textId="5D69AA24">
-      <w:pPr>
-        <w:keepNext w:val="1"/>
-        <w:shd w:val="clear" w:color="auto" w:fill="FFFFFF" w:themeFill="background1"/>
+        </w:rPr>
+      </w:pPr>
+    </w:p>
+    <w:p>
+      <w:pPr>
+        <w:keepNext/>
+        <w:shd w:val="clear" w:fill="FFFFFF" w:themeFill="background1"/>
         <w:spacing w:after="0" w:line="240" w:lineRule="auto"/>
         <w:ind w:left="426" w:right="538"/>
         <w:jc w:val="center"/>
@@ -292,32 +236,26 @@
           <w:iCs w:val="0"/>
           <w:caps w:val="0"/>
           <w:smallCaps w:val="0"/>
-          <w:noProof w:val="0"/>
           <w:color w:val="000000" w:themeColor="text1" w:themeTint="FF" w:themeShade="FF"/>
           <w:sz w:val="36"/>
           <w:szCs w:val="36"/>
-          <w:lang w:val="en-US"/>
-        </w:rPr>
-      </w:pPr>
-      <w:r>
-        <w:rPr>
-          <w:rFonts w:ascii="Gill Sans MT" w:hAnsi="Gill Sans MT" w:eastAsia="Gill Sans MT" w:cs="Gill Sans MT"/>
-          <w:b w:val="1"/>
-          <w:bCs w:val="1"/>
-          <w:i w:val="1"/>
-          <w:iCs w:val="1"/>
-          <w:caps w:val="0"/>
-          <w:smallCaps w:val="0"/>
-          <w:noProof w:val="0"/>
+        </w:rPr>
+      </w:pPr>
+      <w:r>
+        <w:rPr>
+          <w:rFonts w:ascii="Gill Sans MT" w:hAnsi="Gill Sans MT" w:eastAsia="Gill Sans MT" w:cs="Gill Sans MT"/>
+          <w:b/>
+          <w:bCs/>
+          <w:i/>
+          <w:iCs/>
           <w:color w:val="000000" w:themeColor="text1" w:themeTint="FF" w:themeShade="FF"/>
           <w:sz w:val="36"/>
           <w:szCs w:val="36"/>
-          <w:lang w:val="fr-FR"/>
         </w:rPr>
         <w:t>ATTESTATION DE TRAVAIL</w:t>
       </w:r>
     </w:p>
-    <w:p xmlns:wp14="http://schemas.microsoft.com/office/word/2010/wordml" wp14:paraId="68397303" wp14:textId="2F36750F">
+    <w:p>
       <w:pPr>
         <w:spacing w:after="0" w:line="240" w:lineRule="auto"/>
         <w:ind w:left="426"/>
@@ -329,15 +267,13 @@
           <w:iCs w:val="0"/>
           <w:caps w:val="0"/>
           <w:smallCaps w:val="0"/>
-          <w:noProof w:val="0"/>
           <w:color w:val="000000" w:themeColor="text1" w:themeTint="FF" w:themeShade="FF"/>
           <w:sz w:val="24"/>
           <w:szCs w:val="24"/>
-          <w:lang w:val="en-US"/>
-        </w:rPr>
-      </w:pPr>
-    </w:p>
-    <w:p xmlns:wp14="http://schemas.microsoft.com/office/word/2010/wordml" wp14:paraId="533F635B" wp14:textId="2241F0C4">
+        </w:rPr>
+      </w:pPr>
+    </w:p>
+    <w:p>
       <w:pPr>
         <w:spacing w:after="200" w:line="276" w:lineRule="auto"/>
         <w:rPr>
@@ -348,15 +284,13 @@
           <w:iCs w:val="0"/>
           <w:caps w:val="0"/>
           <w:smallCaps w:val="0"/>
-          <w:noProof w:val="0"/>
           <w:color w:val="000000" w:themeColor="text1" w:themeTint="FF" w:themeShade="FF"/>
           <w:sz w:val="22"/>
           <w:szCs w:val="22"/>
-          <w:lang w:val="en-US"/>
-        </w:rPr>
-      </w:pPr>
-    </w:p>
-    <w:p xmlns:wp14="http://schemas.microsoft.com/office/word/2010/wordml" wp14:paraId="12B87FCD" wp14:textId="26135568">
+        </w:rPr>
+      </w:pPr>
+    </w:p>
+    <w:p>
       <w:pPr>
         <w:spacing w:after="200" w:line="276" w:lineRule="auto"/>
         <w:rPr>
@@ -367,15 +301,13 @@
           <w:iCs w:val="0"/>
           <w:caps w:val="0"/>
           <w:smallCaps w:val="0"/>
-          <w:noProof w:val="0"/>
           <w:color w:val="000000" w:themeColor="text1" w:themeTint="FF" w:themeShade="FF"/>
           <w:sz w:val="22"/>
           <w:szCs w:val="22"/>
-          <w:lang w:val="en-US"/>
-        </w:rPr>
-      </w:pPr>
-    </w:p>
-    <w:p xmlns:wp14="http://schemas.microsoft.com/office/word/2010/wordml" wp14:paraId="01CE2B37" wp14:textId="67987705">
+        </w:rPr>
+      </w:pPr>
+    </w:p>
+    <w:p>
       <w:pPr>
         <w:spacing w:after="0" w:line="240" w:lineRule="auto"/>
         <w:ind w:left="426"/>
@@ -387,15 +319,13 @@
           <w:iCs w:val="0"/>
           <w:caps w:val="0"/>
           <w:smallCaps w:val="0"/>
-          <w:noProof w:val="0"/>
-          <w:color w:val="000000" w:themeColor="text1" w:themeTint="FF" w:themeShade="FF"/>
-          <w:sz w:val="26"/>
-          <w:szCs w:val="26"/>
-          <w:lang w:val="en-US"/>
-        </w:rPr>
-      </w:pPr>
-    </w:p>
-    <w:p xmlns:wp14="http://schemas.microsoft.com/office/word/2010/wordml" wp14:paraId="65573440" wp14:textId="652C8268">
+          <w:color w:val="000000" w:themeColor="text1" w:themeTint="FF" w:themeShade="FF"/>
+          <w:sz w:val="26"/>
+          <w:szCs w:val="26"/>
+        </w:rPr>
+      </w:pPr>
+    </w:p>
+    <w:p>
       <w:pPr>
         <w:spacing w:after="0" w:line="240" w:lineRule="auto"/>
         <w:ind w:left="426"/>
@@ -407,219 +337,133 @@
           <w:iCs w:val="0"/>
           <w:caps w:val="0"/>
           <w:smallCaps w:val="0"/>
-          <w:noProof w:val="0"/>
-          <w:color w:val="000000" w:themeColor="text1" w:themeTint="FF" w:themeShade="FF"/>
-          <w:sz w:val="26"/>
-          <w:szCs w:val="26"/>
-          <w:lang w:val="en-US"/>
-        </w:rPr>
-      </w:pPr>
-      <w:r>
-        <w:rPr>
-          <w:rFonts w:ascii="Gill Sans MT" w:hAnsi="Gill Sans MT" w:eastAsia="Gill Sans MT" w:cs="Gill Sans MT"/>
-          <w:b w:val="1"/>
-          <w:bCs w:val="1"/>
-          <w:i w:val="0"/>
-          <w:iCs w:val="0"/>
-          <w:caps w:val="0"/>
-          <w:smallCaps w:val="0"/>
-          <w:noProof w:val="0"/>
-          <w:color w:val="000000" w:themeColor="text1" w:themeTint="FF" w:themeShade="FF"/>
-          <w:sz w:val="26"/>
-          <w:szCs w:val="26"/>
-          <w:lang w:val="fr-FR"/>
+          <w:color w:val="000000" w:themeColor="text1" w:themeTint="FF" w:themeShade="FF"/>
+          <w:sz w:val="26"/>
+          <w:szCs w:val="26"/>
+        </w:rPr>
+      </w:pPr>
+      <w:r>
+        <w:rPr>
+          <w:rFonts w:ascii="Gill Sans MT" w:hAnsi="Gill Sans MT" w:eastAsia="Gill Sans MT" w:cs="Gill Sans MT"/>
+          <w:b/>
+          <w:bCs/>
+          <w:color w:val="000000" w:themeColor="text1" w:themeTint="FF" w:themeShade="FF"/>
+          <w:sz w:val="26"/>
+          <w:szCs w:val="26"/>
         </w:rPr>
         <w:t>N</w:t>
       </w:r>
       <w:r>
         <w:rPr>
           <w:rFonts w:ascii="Gill Sans MT" w:hAnsi="Gill Sans MT" w:eastAsia="Gill Sans MT" w:cs="Gill Sans MT"/>
-          <w:b w:val="0"/>
-          <w:bCs w:val="0"/>
-          <w:i w:val="0"/>
-          <w:iCs w:val="0"/>
-          <w:caps w:val="0"/>
-          <w:smallCaps w:val="0"/>
-          <w:noProof w:val="0"/>
-          <w:color w:val="000000" w:themeColor="text1" w:themeTint="FF" w:themeShade="FF"/>
-          <w:sz w:val="26"/>
-          <w:szCs w:val="26"/>
-          <w:lang w:val="fr-FR"/>
+          <w:color w:val="000000" w:themeColor="text1" w:themeTint="FF" w:themeShade="FF"/>
+          <w:sz w:val="26"/>
+          <w:szCs w:val="26"/>
         </w:rPr>
         <w:t xml:space="preserve">ous, soussignés </w:t>
       </w:r>
       <w:r>
         <w:rPr>
           <w:rFonts w:ascii="Gill Sans MT" w:hAnsi="Gill Sans MT" w:eastAsia="Gill Sans MT" w:cs="Gill Sans MT"/>
-          <w:b w:val="1"/>
-          <w:bCs w:val="1"/>
-          <w:i w:val="0"/>
-          <w:iCs w:val="0"/>
-          <w:caps w:val="0"/>
-          <w:smallCaps w:val="0"/>
-          <w:noProof w:val="0"/>
-          <w:color w:val="000000" w:themeColor="text1" w:themeTint="FF" w:themeShade="FF"/>
-          <w:sz w:val="26"/>
-          <w:szCs w:val="26"/>
-          <w:lang w:val="fr-FR"/>
+          <w:b/>
+          <w:bCs/>
+          <w:color w:val="000000" w:themeColor="text1" w:themeTint="FF" w:themeShade="FF"/>
+          <w:sz w:val="26"/>
+          <w:szCs w:val="26"/>
         </w:rPr>
         <w:t>O</w:t>
       </w:r>
       <w:r>
         <w:rPr>
           <w:rFonts w:ascii="Gill Sans MT" w:hAnsi="Gill Sans MT" w:eastAsia="Gill Sans MT" w:cs="Gill Sans MT"/>
-          <w:b w:val="0"/>
-          <w:bCs w:val="0"/>
-          <w:i w:val="0"/>
-          <w:iCs w:val="0"/>
-          <w:caps w:val="0"/>
-          <w:smallCaps w:val="0"/>
-          <w:noProof w:val="0"/>
-          <w:color w:val="000000" w:themeColor="text1" w:themeTint="FF" w:themeShade="FF"/>
-          <w:sz w:val="26"/>
-          <w:szCs w:val="26"/>
-          <w:lang w:val="fr-FR"/>
+          <w:color w:val="000000" w:themeColor="text1" w:themeTint="FF" w:themeShade="FF"/>
+          <w:sz w:val="26"/>
+          <w:szCs w:val="26"/>
         </w:rPr>
         <w:t xml:space="preserve">ffice de la </w:t>
       </w:r>
       <w:r>
         <w:rPr>
           <w:rFonts w:ascii="Gill Sans MT" w:hAnsi="Gill Sans MT" w:eastAsia="Gill Sans MT" w:cs="Gill Sans MT"/>
-          <w:b w:val="1"/>
-          <w:bCs w:val="1"/>
-          <w:i w:val="0"/>
-          <w:iCs w:val="0"/>
-          <w:caps w:val="0"/>
-          <w:smallCaps w:val="0"/>
-          <w:noProof w:val="0"/>
-          <w:color w:val="000000" w:themeColor="text1" w:themeTint="FF" w:themeShade="FF"/>
-          <w:sz w:val="26"/>
-          <w:szCs w:val="26"/>
-          <w:lang w:val="fr-FR"/>
+          <w:b/>
+          <w:bCs/>
+          <w:color w:val="000000" w:themeColor="text1" w:themeTint="FF" w:themeShade="FF"/>
+          <w:sz w:val="26"/>
+          <w:szCs w:val="26"/>
         </w:rPr>
         <w:t>F</w:t>
       </w:r>
       <w:r>
         <w:rPr>
           <w:rFonts w:ascii="Gill Sans MT" w:hAnsi="Gill Sans MT" w:eastAsia="Gill Sans MT" w:cs="Gill Sans MT"/>
-          <w:b w:val="0"/>
-          <w:bCs w:val="0"/>
-          <w:i w:val="0"/>
-          <w:iCs w:val="0"/>
-          <w:caps w:val="0"/>
-          <w:smallCaps w:val="0"/>
-          <w:noProof w:val="0"/>
-          <w:color w:val="000000" w:themeColor="text1" w:themeTint="FF" w:themeShade="FF"/>
-          <w:sz w:val="26"/>
-          <w:szCs w:val="26"/>
-          <w:lang w:val="fr-FR"/>
+          <w:color w:val="000000" w:themeColor="text1" w:themeTint="FF" w:themeShade="FF"/>
+          <w:sz w:val="26"/>
+          <w:szCs w:val="26"/>
         </w:rPr>
         <w:t xml:space="preserve">ormation </w:t>
       </w:r>
       <w:r>
         <w:rPr>
           <w:rFonts w:ascii="Gill Sans MT" w:hAnsi="Gill Sans MT" w:eastAsia="Gill Sans MT" w:cs="Gill Sans MT"/>
-          <w:b w:val="1"/>
-          <w:bCs w:val="1"/>
-          <w:i w:val="0"/>
-          <w:iCs w:val="0"/>
-          <w:caps w:val="0"/>
-          <w:smallCaps w:val="0"/>
-          <w:noProof w:val="0"/>
-          <w:color w:val="000000" w:themeColor="text1" w:themeTint="FF" w:themeShade="FF"/>
-          <w:sz w:val="26"/>
-          <w:szCs w:val="26"/>
-          <w:lang w:val="fr-FR"/>
+          <w:b/>
+          <w:bCs/>
+          <w:color w:val="000000" w:themeColor="text1" w:themeTint="FF" w:themeShade="FF"/>
+          <w:sz w:val="26"/>
+          <w:szCs w:val="26"/>
         </w:rPr>
         <w:t>P</w:t>
       </w:r>
       <w:r>
         <w:rPr>
           <w:rFonts w:ascii="Gill Sans MT" w:hAnsi="Gill Sans MT" w:eastAsia="Gill Sans MT" w:cs="Gill Sans MT"/>
-          <w:b w:val="0"/>
-          <w:bCs w:val="0"/>
-          <w:i w:val="0"/>
-          <w:iCs w:val="0"/>
-          <w:caps w:val="0"/>
-          <w:smallCaps w:val="0"/>
-          <w:noProof w:val="0"/>
-          <w:color w:val="000000" w:themeColor="text1" w:themeTint="FF" w:themeShade="FF"/>
-          <w:sz w:val="26"/>
-          <w:szCs w:val="26"/>
-          <w:lang w:val="fr-FR"/>
+          <w:color w:val="000000" w:themeColor="text1" w:themeTint="FF" w:themeShade="FF"/>
+          <w:sz w:val="26"/>
+          <w:szCs w:val="26"/>
         </w:rPr>
         <w:t xml:space="preserve">rofessionnelle et de la </w:t>
       </w:r>
       <w:r>
         <w:rPr>
           <w:rFonts w:ascii="Gill Sans MT" w:hAnsi="Gill Sans MT" w:eastAsia="Gill Sans MT" w:cs="Gill Sans MT"/>
-          <w:b w:val="1"/>
-          <w:bCs w:val="1"/>
-          <w:i w:val="0"/>
-          <w:iCs w:val="0"/>
-          <w:caps w:val="0"/>
-          <w:smallCaps w:val="0"/>
-          <w:noProof w:val="0"/>
-          <w:color w:val="000000" w:themeColor="text1" w:themeTint="FF" w:themeShade="FF"/>
-          <w:sz w:val="26"/>
-          <w:szCs w:val="26"/>
-          <w:lang w:val="fr-FR"/>
+          <w:b/>
+          <w:bCs/>
+          <w:color w:val="000000" w:themeColor="text1" w:themeTint="FF" w:themeShade="FF"/>
+          <w:sz w:val="26"/>
+          <w:szCs w:val="26"/>
         </w:rPr>
         <w:t>P</w:t>
       </w:r>
       <w:r>
         <w:rPr>
           <w:rFonts w:ascii="Gill Sans MT" w:hAnsi="Gill Sans MT" w:eastAsia="Gill Sans MT" w:cs="Gill Sans MT"/>
-          <w:b w:val="0"/>
-          <w:bCs w:val="0"/>
-          <w:i w:val="0"/>
-          <w:iCs w:val="0"/>
-          <w:caps w:val="0"/>
-          <w:smallCaps w:val="0"/>
-          <w:noProof w:val="0"/>
-          <w:color w:val="000000" w:themeColor="text1" w:themeTint="FF" w:themeShade="FF"/>
-          <w:sz w:val="26"/>
-          <w:szCs w:val="26"/>
-          <w:lang w:val="fr-FR"/>
+          <w:color w:val="000000" w:themeColor="text1" w:themeTint="FF" w:themeShade="FF"/>
+          <w:sz w:val="26"/>
+          <w:szCs w:val="26"/>
         </w:rPr>
         <w:t xml:space="preserve">romotion du </w:t>
       </w:r>
       <w:r>
         <w:rPr>
           <w:rFonts w:ascii="Gill Sans MT" w:hAnsi="Gill Sans MT" w:eastAsia="Gill Sans MT" w:cs="Gill Sans MT"/>
-          <w:b w:val="1"/>
-          <w:bCs w:val="1"/>
-          <w:i w:val="0"/>
-          <w:iCs w:val="0"/>
-          <w:caps w:val="0"/>
-          <w:smallCaps w:val="0"/>
-          <w:noProof w:val="0"/>
-          <w:color w:val="000000" w:themeColor="text1" w:themeTint="FF" w:themeShade="FF"/>
-          <w:sz w:val="26"/>
-          <w:szCs w:val="26"/>
-          <w:lang w:val="fr-FR"/>
+          <w:b/>
+          <w:bCs/>
+          <w:color w:val="000000" w:themeColor="text1" w:themeTint="FF" w:themeShade="FF"/>
+          <w:sz w:val="26"/>
+          <w:szCs w:val="26"/>
         </w:rPr>
         <w:t>T</w:t>
       </w:r>
       <w:r>
         <w:rPr>
           <w:rFonts w:ascii="Gill Sans MT" w:hAnsi="Gill Sans MT" w:eastAsia="Gill Sans MT" w:cs="Gill Sans MT"/>
-          <w:b w:val="0"/>
-          <w:bCs w:val="0"/>
-          <w:i w:val="0"/>
-          <w:iCs w:val="0"/>
-          <w:caps w:val="0"/>
-          <w:smallCaps w:val="0"/>
-          <w:noProof w:val="0"/>
-          <w:color w:val="000000" w:themeColor="text1" w:themeTint="FF" w:themeShade="FF"/>
-          <w:sz w:val="26"/>
-          <w:szCs w:val="26"/>
-          <w:lang w:val="fr-FR"/>
+          <w:color w:val="000000" w:themeColor="text1" w:themeTint="FF" w:themeShade="FF"/>
+          <w:sz w:val="26"/>
+          <w:szCs w:val="26"/>
         </w:rPr>
         <w:t>ravail, attestons que :</w:t>
       </w:r>
     </w:p>
-    <w:p xmlns:wp14="http://schemas.microsoft.com/office/word/2010/wordml" wp14:paraId="45731A47" wp14:textId="270C28D1">
+    <w:p>
       <w:pPr>
         <w:spacing w:after="0" w:line="240" w:lineRule="auto"/>
         <w:ind w:left="426"/>
@@ -631,18 +475,16 @@
           <w:iCs w:val="0"/>
           <w:caps w:val="0"/>
           <w:smallCaps w:val="0"/>
-          <w:noProof w:val="0"/>
-          <w:color w:val="000000" w:themeColor="text1" w:themeTint="FF" w:themeShade="FF"/>
-          <w:sz w:val="26"/>
-          <w:szCs w:val="26"/>
-          <w:lang w:val="en-US"/>
-        </w:rPr>
-      </w:pPr>
-    </w:p>
-    <w:p xmlns:wp14="http://schemas.microsoft.com/office/word/2010/wordml" wp14:paraId="0BB59C06" wp14:textId="7350A17D">
+          <w:color w:val="000000" w:themeColor="text1" w:themeTint="FF" w:themeShade="FF"/>
+          <w:sz w:val="26"/>
+          <w:szCs w:val="26"/>
+        </w:rPr>
+      </w:pPr>
+    </w:p>
+    <w:p>
       <w:pPr>
         <w:tabs>
-          <w:tab w:val="left" w:leader="none" w:pos="2431"/>
+          <w:tab w:val="left" w:pos="2431"/>
         </w:tabs>
         <w:spacing w:after="0" w:line="240" w:lineRule="auto"/>
         <w:ind w:left="426"/>
@@ -654,188 +496,25 @@
           <w:iCs w:val="0"/>
           <w:caps w:val="0"/>
           <w:smallCaps w:val="0"/>
-          <w:noProof w:val="0"/>
-          <w:color w:val="000000" w:themeColor="text1" w:themeTint="FF" w:themeShade="FF"/>
-          <w:sz w:val="26"/>
-          <w:szCs w:val="26"/>
-          <w:lang w:val="en-US"/>
-        </w:rPr>
-      </w:pPr>
-      <w:r>
-        <w:rPr>
-          <w:rFonts w:ascii="Gill Sans MT" w:hAnsi="Gill Sans MT" w:eastAsia="Gill Sans MT" w:cs="Gill Sans MT"/>
-          <w:b w:val="0"/>
-          <w:bCs w:val="0"/>
-          <w:i w:val="0"/>
-          <w:iCs w:val="0"/>
-          <w:caps w:val="0"/>
-          <w:smallCaps w:val="0"/>
-          <w:noProof w:val="0"/>
-          <w:color w:val="000000" w:themeColor="text1" w:themeTint="FF" w:themeShade="FF"/>
-          <w:sz w:val="26"/>
-          <w:szCs w:val="26"/>
-          <w:lang w:val="fr-FR"/>
-        </w:rPr>
-        <w:t>${</w:t>
-      </w:r>
-      <w:r>
-        <w:rPr>
-          <w:rFonts w:ascii="Gill Sans MT" w:hAnsi="Gill Sans MT" w:eastAsia="Gill Sans MT" w:cs="Gill Sans MT"/>
-          <w:b w:val="0"/>
-          <w:bCs w:val="0"/>
-          <w:i w:val="0"/>
-          <w:iCs w:val="0"/>
-          <w:caps w:val="0"/>
-          <w:smallCaps w:val="0"/>
-          <w:noProof w:val="0"/>
-          <w:color w:val="000000" w:themeColor="text1" w:themeTint="FF" w:themeShade="FF"/>
-          <w:sz w:val="26"/>
-          <w:szCs w:val="26"/>
-          <w:lang w:val="fr-FR"/>
-        </w:rPr>
-        <w:t>title</w:t>
-      </w:r>
-      <w:r>
-        <w:rPr>
-          <w:rFonts w:ascii="Gill Sans MT" w:hAnsi="Gill Sans MT" w:eastAsia="Gill Sans MT" w:cs="Gill Sans MT"/>
-          <w:b w:val="0"/>
-          <w:bCs w:val="0"/>
-          <w:i w:val="0"/>
-          <w:iCs w:val="0"/>
-          <w:caps w:val="0"/>
-          <w:smallCaps w:val="0"/>
-          <w:noProof w:val="0"/>
-          <w:color w:val="000000" w:themeColor="text1" w:themeTint="FF" w:themeShade="FF"/>
-          <w:sz w:val="26"/>
-          <w:szCs w:val="26"/>
-          <w:lang w:val="fr-FR"/>
-        </w:rPr>
-        <w:t xml:space="preserve">}         </w:t>
-      </w:r>
-      <w:r>
-        <w:rPr>
-          <w:rFonts w:ascii="Gill Sans MT" w:hAnsi="Gill Sans MT" w:eastAsia="Gill Sans MT" w:cs="Gill Sans MT"/>
-          <w:b w:val="0"/>
-          <w:bCs w:val="0"/>
-          <w:i w:val="0"/>
-          <w:iCs w:val="0"/>
-          <w:caps w:val="0"/>
-          <w:smallCaps w:val="0"/>
-          <w:noProof w:val="0"/>
-          <w:color w:val="000000" w:themeColor="text1" w:themeTint="FF" w:themeShade="FF"/>
-          <w:sz w:val="26"/>
-          <w:szCs w:val="26"/>
-          <w:lang w:val="fr-FR"/>
-        </w:rPr>
-        <w:t xml:space="preserve">    </w:t>
-      </w:r>
-      <w:r>
-        <w:rPr>
-          <w:rFonts w:ascii="Gill Sans MT" w:hAnsi="Gill Sans MT" w:eastAsia="Gill Sans MT" w:cs="Gill Sans MT"/>
-          <w:b w:val="0"/>
-          <w:bCs w:val="0"/>
-          <w:i w:val="0"/>
-          <w:iCs w:val="0"/>
-          <w:caps w:val="0"/>
-          <w:smallCaps w:val="0"/>
-          <w:noProof w:val="0"/>
-          <w:color w:val="000000" w:themeColor="text1" w:themeTint="FF" w:themeShade="FF"/>
-          <w:sz w:val="26"/>
-          <w:szCs w:val="26"/>
-          <w:lang w:val="fr-FR"/>
-        </w:rPr>
-        <w:t xml:space="preserve">      </w:t>
-      </w:r>
-      <w:r>
-        <w:rPr>
-          <w:rFonts w:ascii="Gill Sans MT" w:hAnsi="Gill Sans MT" w:eastAsia="Gill Sans MT" w:cs="Gill Sans MT"/>
-          <w:b w:val="0"/>
-          <w:bCs w:val="0"/>
-          <w:i w:val="0"/>
-          <w:iCs w:val="0"/>
-          <w:caps w:val="0"/>
-          <w:smallCaps w:val="0"/>
-          <w:noProof w:val="0"/>
-          <w:color w:val="000000" w:themeColor="text1" w:themeTint="FF" w:themeShade="FF"/>
-          <w:sz w:val="26"/>
-          <w:szCs w:val="26"/>
-          <w:lang w:val="fr-FR"/>
-        </w:rPr>
-        <w:t xml:space="preserve">  : </w:t>
-      </w:r>
-      <w:r>
-        <w:rPr>
-          <w:rFonts w:ascii="Gill Sans MT" w:hAnsi="Gill Sans MT" w:eastAsia="Gill Sans MT" w:cs="Gill Sans MT"/>
-          <w:b w:val="0"/>
-          <w:bCs w:val="0"/>
-          <w:i w:val="0"/>
-          <w:iCs w:val="0"/>
-          <w:caps w:val="0"/>
-          <w:smallCaps w:val="0"/>
-          <w:noProof w:val="0"/>
-          <w:color w:val="000000" w:themeColor="text1" w:themeTint="FF" w:themeShade="FF"/>
-          <w:sz w:val="26"/>
-          <w:szCs w:val="26"/>
-          <w:lang w:val="fr-FR"/>
-        </w:rPr>
-        <w:t>$</w:t>
-      </w:r>
-      <w:r>
-        <w:rPr>
-          <w:rFonts w:ascii="Gill Sans MT" w:hAnsi="Gill Sans MT" w:eastAsia="Gill Sans MT" w:cs="Gill Sans MT"/>
-          <w:b w:val="0"/>
-          <w:bCs w:val="0"/>
-          <w:i w:val="0"/>
-          <w:iCs w:val="0"/>
-          <w:caps w:val="0"/>
-          <w:smallCaps w:val="0"/>
-          <w:noProof w:val="0"/>
-          <w:color w:val="000000" w:themeColor="text1" w:themeTint="FF" w:themeShade="FF"/>
-          <w:sz w:val="26"/>
-          <w:szCs w:val="26"/>
-          <w:lang w:val="fr-FR"/>
-        </w:rPr>
-        <w:t>{</w:t>
-      </w:r>
-      <w:r>
-        <w:rPr>
-          <w:rFonts w:ascii="Gill Sans MT" w:hAnsi="Gill Sans MT" w:eastAsia="Gill Sans MT" w:cs="Gill Sans MT"/>
-          <w:b w:val="0"/>
-          <w:bCs w:val="0"/>
-          <w:i w:val="0"/>
-          <w:iCs w:val="0"/>
-          <w:caps w:val="0"/>
-          <w:smallCaps w:val="0"/>
-          <w:noProof w:val="0"/>
-          <w:color w:val="000000" w:themeColor="text1" w:themeTint="FF" w:themeShade="FF"/>
-          <w:sz w:val="26"/>
-          <w:szCs w:val="26"/>
-          <w:lang w:val="fr-FR"/>
-        </w:rPr>
-        <w:t>name</w:t>
-      </w:r>
-      <w:r>
-        <w:rPr>
-          <w:rFonts w:ascii="Gill Sans MT" w:hAnsi="Gill Sans MT" w:eastAsia="Gill Sans MT" w:cs="Gill Sans MT"/>
-          <w:b w:val="0"/>
-          <w:bCs w:val="0"/>
-          <w:i w:val="0"/>
-          <w:iCs w:val="0"/>
-          <w:caps w:val="0"/>
-          <w:smallCaps w:val="0"/>
-          <w:noProof w:val="0"/>
-          <w:color w:val="000000" w:themeColor="text1" w:themeTint="FF" w:themeShade="FF"/>
-          <w:sz w:val="26"/>
-          <w:szCs w:val="26"/>
-          <w:lang w:val="fr-FR"/>
-        </w:rPr>
-        <w:t>}</w:t>
-      </w:r>
-    </w:p>
-    <w:p xmlns:wp14="http://schemas.microsoft.com/office/word/2010/wordml" wp14:paraId="031893D2" wp14:textId="20C253A3">
+          <w:color w:val="000000" w:themeColor="text1" w:themeTint="FF" w:themeShade="FF"/>
+          <w:sz w:val="26"/>
+          <w:szCs w:val="26"/>
+        </w:rPr>
+      </w:pPr>
+      <w:r>
+        <w:rPr>
+          <w:rFonts w:ascii="Gill Sans MT" w:hAnsi="Gill Sans MT" w:eastAsia="Gill Sans MT" w:cs="Gill Sans MT"/>
+          <w:color w:val="000000" w:themeColor="text1" w:themeTint="FF" w:themeShade="FF"/>
+          <w:sz w:val="26"/>
+          <w:szCs w:val="26"/>
+        </w:rPr>
+        <w:t xml:space="preserve">${title}                     : ${fullname}</w:t>
+      </w:r>
+    </w:p>
+    <w:p>
       <w:pPr>
         <w:tabs>
-          <w:tab w:val="left" w:leader="none" w:pos="2431"/>
+          <w:tab w:val="left" w:pos="2431"/>
         </w:tabs>
         <w:spacing w:after="0" w:line="240" w:lineRule="auto"/>
         <w:ind w:left="426"/>
@@ -847,27 +526,17 @@
           <w:iCs w:val="0"/>
           <w:caps w:val="0"/>
           <w:smallCaps w:val="0"/>
-          <w:noProof w:val="0"/>
-          <w:color w:val="000000" w:themeColor="text1" w:themeTint="FF" w:themeShade="FF"/>
-          <w:sz w:val="26"/>
-          <w:szCs w:val="26"/>
-          <w:lang w:val="fr-FR"/>
-        </w:rPr>
-      </w:pPr>
-      <w:r>
-        <w:rPr>
-          <w:rFonts w:ascii="Gill Sans MT" w:hAnsi="Gill Sans MT" w:eastAsia="Gill Sans MT" w:cs="Gill Sans MT"/>
-          <w:b w:val="0"/>
-          <w:bCs w:val="0"/>
-          <w:i w:val="0"/>
-          <w:iCs w:val="0"/>
-          <w:caps w:val="0"/>
-          <w:smallCaps w:val="0"/>
-          <w:noProof w:val="0"/>
-          <w:color w:val="000000" w:themeColor="text1" w:themeTint="FF" w:themeShade="FF"/>
-          <w:sz w:val="26"/>
-          <w:szCs w:val="26"/>
-          <w:lang w:val="fr-FR"/>
+          <w:color w:val="000000" w:themeColor="text1" w:themeTint="FF" w:themeShade="FF"/>
+          <w:sz w:val="26"/>
+          <w:szCs w:val="26"/>
+        </w:rPr>
+      </w:pPr>
+      <w:r>
+        <w:rPr>
+          <w:rFonts w:ascii="Gill Sans MT" w:hAnsi="Gill Sans MT" w:eastAsia="Gill Sans MT" w:cs="Gill Sans MT"/>
+          <w:color w:val="000000" w:themeColor="text1" w:themeTint="FF" w:themeShade="FF"/>
+          <w:sz w:val="26"/>
+          <w:szCs w:val="26"/>
         </w:rPr>
         <w:t>Matricule </w:t>
       </w:r>
@@ -877,93 +546,17 @@
       <w:r>
         <w:rPr>
           <w:rFonts w:ascii="Gill Sans MT" w:hAnsi="Gill Sans MT" w:eastAsia="Gill Sans MT" w:cs="Gill Sans MT"/>
-          <w:b w:val="0"/>
-          <w:bCs w:val="0"/>
-          <w:i w:val="0"/>
-          <w:iCs w:val="0"/>
-          <w:caps w:val="0"/>
-          <w:smallCaps w:val="0"/>
-          <w:noProof w:val="0"/>
-          <w:color w:val="000000" w:themeColor="text1" w:themeTint="FF" w:themeShade="FF"/>
-          <w:sz w:val="26"/>
-          <w:szCs w:val="26"/>
-          <w:lang w:val="fr-FR"/>
-        </w:rPr>
-        <w:t xml:space="preserve">   : </w:t>
-      </w:r>
-      <w:r>
-        <w:rPr>
-          <w:rFonts w:ascii="Gill Sans MT" w:hAnsi="Gill Sans MT" w:eastAsia="Gill Sans MT" w:cs="Gill Sans MT"/>
-          <w:b w:val="0"/>
-          <w:bCs w:val="0"/>
-          <w:i w:val="0"/>
-          <w:iCs w:val="0"/>
-          <w:caps w:val="0"/>
-          <w:smallCaps w:val="0"/>
-          <w:noProof w:val="0"/>
-          <w:color w:val="000000" w:themeColor="text1" w:themeTint="FF" w:themeShade="FF"/>
-          <w:sz w:val="26"/>
-          <w:szCs w:val="26"/>
-          <w:lang w:val="fr-FR"/>
-        </w:rPr>
-        <w:t>$</w:t>
-      </w:r>
-      <w:r>
-        <w:rPr>
-          <w:rFonts w:ascii="Gill Sans MT" w:hAnsi="Gill Sans MT" w:eastAsia="Gill Sans MT" w:cs="Gill Sans MT"/>
-          <w:b w:val="0"/>
-          <w:bCs w:val="0"/>
-          <w:i w:val="0"/>
-          <w:iCs w:val="0"/>
-          <w:caps w:val="0"/>
-          <w:smallCaps w:val="0"/>
-          <w:noProof w:val="0"/>
-          <w:color w:val="000000" w:themeColor="text1" w:themeTint="FF" w:themeShade="FF"/>
-          <w:sz w:val="26"/>
-          <w:szCs w:val="26"/>
-          <w:lang w:val="fr-FR"/>
-        </w:rPr>
-        <w:t>{</w:t>
-      </w:r>
-      <w:r>
-        <w:rPr>
-          <w:rFonts w:ascii="Gill Sans MT" w:hAnsi="Gill Sans MT" w:eastAsia="Gill Sans MT" w:cs="Gill Sans MT"/>
-          <w:b w:val="0"/>
-          <w:bCs w:val="0"/>
-          <w:i w:val="0"/>
-          <w:iCs w:val="0"/>
-          <w:caps w:val="0"/>
-          <w:smallCaps w:val="0"/>
-          <w:noProof w:val="0"/>
-          <w:color w:val="000000" w:themeColor="text1" w:themeTint="FF" w:themeShade="FF"/>
-          <w:sz w:val="26"/>
-          <w:szCs w:val="26"/>
-          <w:lang w:val="fr-FR"/>
-        </w:rPr>
-        <w:t>employe_id</w:t>
-      </w:r>
-      <w:r>
-        <w:rPr>
-          <w:rFonts w:ascii="Gill Sans MT" w:hAnsi="Gill Sans MT" w:eastAsia="Gill Sans MT" w:cs="Gill Sans MT"/>
-          <w:b w:val="0"/>
-          <w:bCs w:val="0"/>
-          <w:i w:val="0"/>
-          <w:iCs w:val="0"/>
-          <w:caps w:val="0"/>
-          <w:smallCaps w:val="0"/>
-          <w:noProof w:val="0"/>
-          <w:color w:val="000000" w:themeColor="text1" w:themeTint="FF" w:themeShade="FF"/>
-          <w:sz w:val="26"/>
-          <w:szCs w:val="26"/>
-          <w:lang w:val="fr-FR"/>
-        </w:rPr>
-        <w:t>}</w:t>
-      </w:r>
-    </w:p>
-    <w:p xmlns:wp14="http://schemas.microsoft.com/office/word/2010/wordml" wp14:paraId="38ED4BED" wp14:textId="5E58A53F">
+          <w:color w:val="000000" w:themeColor="text1" w:themeTint="FF" w:themeShade="FF"/>
+          <w:sz w:val="26"/>
+          <w:szCs w:val="26"/>
+        </w:rPr>
+        <w:t xml:space="preserve">   : ${matricule}</w:t>
+      </w:r>
+    </w:p>
+    <w:p>
       <w:pPr>
         <w:tabs>
-          <w:tab w:val="left" w:leader="none" w:pos="2431"/>
+          <w:tab w:val="left" w:pos="2431"/>
         </w:tabs>
         <w:spacing w:after="0" w:line="240" w:lineRule="auto"/>
         <w:ind w:left="426"/>
@@ -975,15 +568,13 @@
           <w:iCs w:val="0"/>
           <w:caps w:val="0"/>
           <w:smallCaps w:val="0"/>
-          <w:noProof w:val="0"/>
-          <w:color w:val="000000" w:themeColor="text1" w:themeTint="FF" w:themeShade="FF"/>
-          <w:sz w:val="26"/>
-          <w:szCs w:val="26"/>
-          <w:lang w:val="en-US"/>
-        </w:rPr>
-      </w:pPr>
-    </w:p>
-    <w:p xmlns:wp14="http://schemas.microsoft.com/office/word/2010/wordml" wp14:paraId="5BEC1E62" wp14:textId="185BC080">
+          <w:color w:val="000000" w:themeColor="text1" w:themeTint="FF" w:themeShade="FF"/>
+          <w:sz w:val="26"/>
+          <w:szCs w:val="26"/>
+        </w:rPr>
+      </w:pPr>
+    </w:p>
+    <w:p>
       <w:pPr>
         <w:spacing w:after="0" w:line="240" w:lineRule="auto"/>
         <w:ind w:left="426"/>
@@ -995,32 +586,22 @@
           <w:iCs w:val="0"/>
           <w:caps w:val="0"/>
           <w:smallCaps w:val="0"/>
-          <w:noProof w:val="0"/>
-          <w:color w:val="000000" w:themeColor="text1" w:themeTint="FF" w:themeShade="FF"/>
-          <w:sz w:val="26"/>
-          <w:szCs w:val="26"/>
-          <w:lang w:val="en-US"/>
-        </w:rPr>
-      </w:pPr>
-      <w:r>
-        <w:rPr>
-          <w:rFonts w:ascii="Gill Sans MT" w:hAnsi="Gill Sans MT" w:eastAsia="Gill Sans MT" w:cs="Gill Sans MT"/>
-          <w:b w:val="0"/>
-          <w:bCs w:val="0"/>
-          <w:i w:val="0"/>
-          <w:iCs w:val="0"/>
-          <w:caps w:val="0"/>
-          <w:smallCaps w:val="0"/>
-          <w:noProof w:val="0"/>
-          <w:color w:val="000000" w:themeColor="text1" w:themeTint="FF" w:themeShade="FF"/>
-          <w:sz w:val="26"/>
-          <w:szCs w:val="26"/>
-          <w:lang w:val="fr-FR"/>
+          <w:color w:val="000000" w:themeColor="text1" w:themeTint="FF" w:themeShade="FF"/>
+          <w:sz w:val="26"/>
+          <w:szCs w:val="26"/>
+        </w:rPr>
+      </w:pPr>
+      <w:r>
+        <w:rPr>
+          <w:rFonts w:ascii="Gill Sans MT" w:hAnsi="Gill Sans MT" w:eastAsia="Gill Sans MT" w:cs="Gill Sans MT"/>
+          <w:color w:val="000000" w:themeColor="text1" w:themeTint="FF" w:themeShade="FF"/>
+          <w:sz w:val="26"/>
+          <w:szCs w:val="26"/>
         </w:rPr>
         <w:t xml:space="preserve">Est employée au sein de nos services en qualité de : </w:t>
       </w:r>
     </w:p>
-    <w:p xmlns:wp14="http://schemas.microsoft.com/office/word/2010/wordml" wp14:paraId="346EEB15" wp14:textId="1E051910">
+    <w:p>
       <w:pPr>
         <w:spacing w:after="0" w:line="240" w:lineRule="auto"/>
         <w:ind w:left="426"/>
@@ -1032,15 +613,13 @@
           <w:iCs w:val="0"/>
           <w:caps w:val="0"/>
           <w:smallCaps w:val="0"/>
-          <w:noProof w:val="0"/>
-          <w:color w:val="000000" w:themeColor="text1" w:themeTint="FF" w:themeShade="FF"/>
-          <w:sz w:val="26"/>
-          <w:szCs w:val="26"/>
-          <w:lang w:val="en-US"/>
-        </w:rPr>
-      </w:pPr>
-    </w:p>
-    <w:p xmlns:wp14="http://schemas.microsoft.com/office/word/2010/wordml" wp14:paraId="751704C1" wp14:textId="689FA2A3">
+          <w:color w:val="000000" w:themeColor="text1" w:themeTint="FF" w:themeShade="FF"/>
+          <w:sz w:val="26"/>
+          <w:szCs w:val="26"/>
+        </w:rPr>
+      </w:pPr>
+    </w:p>
+    <w:p>
       <w:pPr>
         <w:spacing w:after="0" w:line="240" w:lineRule="auto"/>
         <w:ind w:left="426"/>
@@ -1052,27 +631,17 @@
           <w:iCs w:val="0"/>
           <w:caps w:val="0"/>
           <w:smallCaps w:val="0"/>
-          <w:noProof w:val="0"/>
-          <w:color w:val="000000" w:themeColor="text1" w:themeTint="FF" w:themeShade="FF"/>
-          <w:sz w:val="26"/>
-          <w:szCs w:val="26"/>
-          <w:lang w:val="fr-FR"/>
-        </w:rPr>
-      </w:pPr>
-      <w:r>
-        <w:rPr>
-          <w:rFonts w:ascii="Gill Sans MT" w:hAnsi="Gill Sans MT" w:eastAsia="Gill Sans MT" w:cs="Gill Sans MT"/>
-          <w:b w:val="0"/>
-          <w:bCs w:val="0"/>
-          <w:i w:val="0"/>
-          <w:iCs w:val="0"/>
-          <w:caps w:val="0"/>
-          <w:smallCaps w:val="0"/>
-          <w:noProof w:val="0"/>
-          <w:color w:val="000000" w:themeColor="text1" w:themeTint="FF" w:themeShade="FF"/>
-          <w:sz w:val="26"/>
-          <w:szCs w:val="26"/>
-          <w:lang w:val="fr-FR"/>
+          <w:color w:val="000000" w:themeColor="text1" w:themeTint="FF" w:themeShade="FF"/>
+          <w:sz w:val="26"/>
+          <w:szCs w:val="26"/>
+        </w:rPr>
+      </w:pPr>
+      <w:r>
+        <w:rPr>
+          <w:rFonts w:ascii="Gill Sans MT" w:hAnsi="Gill Sans MT" w:eastAsia="Gill Sans MT" w:cs="Gill Sans MT"/>
+          <w:color w:val="000000" w:themeColor="text1" w:themeTint="FF" w:themeShade="FF"/>
+          <w:sz w:val="26"/>
+          <w:szCs w:val="26"/>
         </w:rPr>
         <w:t xml:space="preserve">Grade </w:t>
       </w:r>
@@ -1082,40 +651,103 @@
       <w:r>
         <w:rPr>
           <w:rFonts w:ascii="Gill Sans MT" w:hAnsi="Gill Sans MT" w:eastAsia="Gill Sans MT" w:cs="Gill Sans MT"/>
-          <w:b w:val="0"/>
-          <w:bCs w:val="0"/>
-          <w:i w:val="0"/>
-          <w:iCs w:val="0"/>
-          <w:caps w:val="0"/>
-          <w:smallCaps w:val="0"/>
-          <w:noProof w:val="0"/>
-          <w:color w:val="000000" w:themeColor="text1" w:themeTint="FF" w:themeShade="FF"/>
-          <w:sz w:val="26"/>
-          <w:szCs w:val="26"/>
-          <w:lang w:val="fr-FR"/>
+          <w:color w:val="000000" w:themeColor="text1" w:themeTint="FF" w:themeShade="FF"/>
+          <w:sz w:val="26"/>
+          <w:szCs w:val="26"/>
+        </w:rPr>
+        <w:t>: ${grade}</w:t>
+      </w:r>
+    </w:p>
+    <w:p>
+      <w:pPr>
+        <w:spacing w:after="0" w:line="240" w:lineRule="auto"/>
+        <w:ind w:left="426"/>
+        <w:rPr>
+          <w:rFonts w:ascii="Gill Sans MT" w:hAnsi="Gill Sans MT" w:eastAsia="Gill Sans MT" w:cs="Gill Sans MT"/>
+          <w:b w:val="0"/>
+          <w:bCs w:val="0"/>
+          <w:i w:val="0"/>
+          <w:iCs w:val="0"/>
+          <w:caps w:val="0"/>
+          <w:smallCaps w:val="0"/>
+          <w:color w:val="000000" w:themeColor="text1" w:themeTint="FF" w:themeShade="FF"/>
+          <w:sz w:val="26"/>
+          <w:szCs w:val="26"/>
+        </w:rPr>
+      </w:pPr>
+      <w:r>
+        <w:rPr>
+          <w:rFonts w:ascii="Gill Sans MT" w:hAnsi="Gill Sans MT" w:eastAsia="Gill Sans MT" w:cs="Gill Sans MT"/>
+          <w:color w:val="000000" w:themeColor="text1" w:themeTint="FF" w:themeShade="FF"/>
+          <w:sz w:val="26"/>
+          <w:szCs w:val="26"/>
+        </w:rPr>
+        <w:t>Lieu</w:t>
+      </w:r>
+      <w:r>
+        <w:tab/>
+      </w:r>
+      <w:r>
+        <w:rPr>
+          <w:rFonts w:ascii="Gill Sans MT" w:hAnsi="Gill Sans MT" w:eastAsia="Gill Sans MT" w:cs="Gill Sans MT"/>
+          <w:color w:val="000000" w:themeColor="text1" w:themeTint="FF" w:themeShade="FF"/>
+          <w:sz w:val="26"/>
+          <w:szCs w:val="26"/>
+        </w:rPr>
+        <w:t>: CMC Béni Mellal-khénifra</w:t>
+      </w:r>
+    </w:p>
+    <w:p>
+      <w:pPr>
+        <w:pStyle w:val="Normal"/>
+        <w:spacing w:after="0" w:line="240" w:lineRule="auto"/>
+        <w:ind w:left="426"/>
+        <w:rPr>
+          <w:rFonts w:ascii="Gill Sans MT" w:hAnsi="Gill Sans MT" w:eastAsia="Gill Sans MT" w:cs="Gill Sans MT"/>
+          <w:b w:val="0"/>
+          <w:bCs w:val="0"/>
+          <w:i w:val="0"/>
+          <w:iCs w:val="0"/>
+          <w:caps w:val="0"/>
+          <w:smallCaps w:val="0"/>
+          <w:color w:val="000000" w:themeColor="text1" w:themeTint="FF" w:themeShade="FF"/>
+          <w:sz w:val="26"/>
+          <w:szCs w:val="26"/>
+        </w:rPr>
+      </w:pPr>
+      <w:r>
+        <w:rPr>
+          <w:rFonts w:ascii="Gill Sans MT" w:hAnsi="Gill Sans MT" w:eastAsia="Gill Sans MT" w:cs="Gill Sans MT"/>
+          <w:color w:val="000000" w:themeColor="text1" w:themeTint="FF" w:themeShade="FF"/>
+          <w:sz w:val="26"/>
+          <w:szCs w:val="26"/>
+        </w:rPr>
+        <w:t xml:space="preserve">Fonction </w:t>
+      </w:r>
+      <w:r>
+        <w:tab/>
+      </w:r>
+      <w:r>
+        <w:rPr>
+          <w:rFonts w:ascii="Gill Sans MT" w:hAnsi="Gill Sans MT" w:eastAsia="Gill Sans MT" w:cs="Gill Sans MT"/>
+          <w:color w:val="000000" w:themeColor="text1" w:themeTint="FF" w:themeShade="FF"/>
+          <w:sz w:val="26"/>
+          <w:szCs w:val="26"/>
         </w:rPr>
         <w:t xml:space="preserve">: </w:t>
       </w:r>
       <w:r>
         <w:rPr>
-          <w:rFonts w:ascii="Gill Sans MT" w:hAnsi="Gill Sans MT" w:eastAsia="Gill Sans MT" w:cs="Gill Sans MT"/>
-          <w:b w:val="0"/>
-          <w:bCs w:val="0"/>
-          <w:i w:val="0"/>
-          <w:iCs w:val="0"/>
-          <w:caps w:val="0"/>
-          <w:smallCaps w:val="0"/>
-          <w:noProof w:val="0"/>
-          <w:color w:val="000000" w:themeColor="text1" w:themeTint="FF" w:themeShade="FF"/>
-          <w:sz w:val="26"/>
-          <w:szCs w:val="26"/>
-          <w:lang w:val="fr-FR"/>
-        </w:rPr>
-        <w:t>${grade}</w:t>
-      </w:r>
-    </w:p>
-    <w:p xmlns:wp14="http://schemas.microsoft.com/office/word/2010/wordml" wp14:paraId="4C6C3598" wp14:textId="6A77FEB8">
-      <w:pPr>
+          <w:rFonts w:ascii="Aptos" w:hAnsi="Aptos" w:cs="Aptos" w:asciiTheme="minorHAnsi" w:hAnsiTheme="minorHAnsi" w:eastAsiaTheme="minorEastAsia" w:csTheme="minorBidi"/>
+          <w:sz w:val="24"/>
+          <w:szCs w:val="24"/>
+        </w:rPr>
+        <w:t>${position}</w:t>
+      </w:r>
+    </w:p>
+    <w:p>
+      <w:pPr>
+        <w:pStyle w:val="Normal"/>
         <w:spacing w:after="0" w:line="240" w:lineRule="auto"/>
         <w:ind w:left="426"/>
         <w:rPr>
@@ -1126,54 +758,31 @@
           <w:iCs w:val="0"/>
           <w:caps w:val="0"/>
           <w:smallCaps w:val="0"/>
-          <w:noProof w:val="0"/>
-          <w:color w:val="000000" w:themeColor="text1" w:themeTint="FF" w:themeShade="FF"/>
-          <w:sz w:val="26"/>
-          <w:szCs w:val="26"/>
-          <w:lang w:val="en-US"/>
-        </w:rPr>
-      </w:pPr>
-      <w:r>
-        <w:rPr>
-          <w:rFonts w:ascii="Gill Sans MT" w:hAnsi="Gill Sans MT" w:eastAsia="Gill Sans MT" w:cs="Gill Sans MT"/>
-          <w:b w:val="0"/>
-          <w:bCs w:val="0"/>
-          <w:i w:val="0"/>
-          <w:iCs w:val="0"/>
-          <w:caps w:val="0"/>
-          <w:smallCaps w:val="0"/>
-          <w:noProof w:val="0"/>
-          <w:color w:val="000000" w:themeColor="text1" w:themeTint="FF" w:themeShade="FF"/>
-          <w:sz w:val="26"/>
-          <w:szCs w:val="26"/>
-          <w:lang w:val="fr-FR"/>
-        </w:rPr>
-        <w:t>Lieu</w:t>
-      </w:r>
-      <w:r>
-        <w:tab/>
-      </w:r>
-      <w:r>
-        <w:rPr>
-          <w:rFonts w:ascii="Gill Sans MT" w:hAnsi="Gill Sans MT" w:eastAsia="Gill Sans MT" w:cs="Gill Sans MT"/>
-          <w:b w:val="0"/>
-          <w:bCs w:val="0"/>
-          <w:i w:val="0"/>
-          <w:iCs w:val="0"/>
-          <w:caps w:val="0"/>
-          <w:smallCaps w:val="0"/>
-          <w:noProof w:val="0"/>
-          <w:color w:val="000000" w:themeColor="text1" w:themeTint="FF" w:themeShade="FF"/>
-          <w:sz w:val="26"/>
-          <w:szCs w:val="26"/>
-          <w:lang w:val="fr-FR"/>
-        </w:rPr>
-        <w:t>: CMC Béni Mellal-khénifra</w:t>
-      </w:r>
-    </w:p>
-    <w:p xmlns:wp14="http://schemas.microsoft.com/office/word/2010/wordml" wp14:paraId="3856666F" wp14:textId="007755FD">
-      <w:pPr>
-        <w:pStyle w:val="Normal"/>
+          <w:color w:val="000000" w:themeColor="text1" w:themeTint="FF" w:themeShade="FF"/>
+          <w:sz w:val="26"/>
+          <w:szCs w:val="26"/>
+        </w:rPr>
+      </w:pPr>
+      <w:r>
+        <w:rPr>
+          <w:rFonts w:ascii="Gill Sans MT" w:hAnsi="Gill Sans MT" w:eastAsia="Gill Sans MT" w:cs="Gill Sans MT"/>
+          <w:color w:val="000000" w:themeColor="text1" w:themeTint="FF" w:themeShade="FF"/>
+          <w:sz w:val="26"/>
+          <w:szCs w:val="26"/>
+        </w:rPr>
+        <w:t xml:space="preserve">La Date de Recrutement : </w:t>
+      </w:r>
+      <w:r>
+        <w:rPr>
+          <w:rFonts w:ascii="Aptos" w:hAnsi="Aptos" w:cs="Aptos" w:asciiTheme="minorHAnsi" w:hAnsiTheme="minorHAnsi" w:eastAsiaTheme="minorEastAsia" w:csTheme="minorBidi"/>
+          <w:sz w:val="24"/>
+          <w:szCs w:val="24"/>
+        </w:rPr>
+        <w:t>${recruitment_date}</w:t>
+      </w:r>
+    </w:p>
+    <w:p>
+      <w:pPr>
         <w:spacing w:after="0" w:line="240" w:lineRule="auto"/>
         <w:ind w:left="426"/>
         <w:rPr>
@@ -1184,58 +793,17 @@
           <w:iCs w:val="0"/>
           <w:caps w:val="0"/>
           <w:smallCaps w:val="0"/>
-          <w:noProof w:val="0"/>
-          <w:color w:val="000000" w:themeColor="text1" w:themeTint="FF" w:themeShade="FF"/>
-          <w:sz w:val="26"/>
-          <w:szCs w:val="26"/>
-          <w:lang w:val="en-US"/>
-        </w:rPr>
-      </w:pPr>
-      <w:r>
-        <w:rPr>
-          <w:rFonts w:ascii="Gill Sans MT" w:hAnsi="Gill Sans MT" w:eastAsia="Gill Sans MT" w:cs="Gill Sans MT"/>
-          <w:b w:val="0"/>
-          <w:bCs w:val="0"/>
-          <w:i w:val="0"/>
-          <w:iCs w:val="0"/>
-          <w:caps w:val="0"/>
-          <w:smallCaps w:val="0"/>
-          <w:noProof w:val="0"/>
-          <w:color w:val="000000" w:themeColor="text1" w:themeTint="FF" w:themeShade="FF"/>
-          <w:sz w:val="26"/>
-          <w:szCs w:val="26"/>
-          <w:lang w:val="fr-FR"/>
-        </w:rPr>
-        <w:t xml:space="preserve">Fonction </w:t>
-      </w:r>
-      <w:r>
-        <w:tab/>
-      </w:r>
-      <w:r>
-        <w:rPr>
-          <w:rFonts w:ascii="Gill Sans MT" w:hAnsi="Gill Sans MT" w:eastAsia="Gill Sans MT" w:cs="Gill Sans MT"/>
-          <w:b w:val="0"/>
-          <w:bCs w:val="0"/>
-          <w:i w:val="0"/>
-          <w:iCs w:val="0"/>
-          <w:caps w:val="0"/>
-          <w:smallCaps w:val="0"/>
-          <w:noProof w:val="0"/>
-          <w:color w:val="000000" w:themeColor="text1" w:themeTint="FF" w:themeShade="FF"/>
-          <w:sz w:val="26"/>
-          <w:szCs w:val="26"/>
-          <w:lang w:val="fr-FR"/>
-        </w:rPr>
-        <w:t xml:space="preserve">: </w:t>
-      </w:r>
-      <w:r>
-        <w:rPr/>
-        <w:t>${position}</w:t>
-      </w:r>
-    </w:p>
-    <w:p xmlns:wp14="http://schemas.microsoft.com/office/word/2010/wordml" wp14:paraId="0492453C" wp14:textId="76CB85C4">
-      <w:pPr>
-        <w:pStyle w:val="Normal"/>
+          <w:color w:val="000000" w:themeColor="text1" w:themeTint="FF" w:themeShade="FF"/>
+          <w:sz w:val="26"/>
+          <w:szCs w:val="26"/>
+        </w:rPr>
+      </w:pPr>
+    </w:p>
+    <w:p>
+      <w:pPr>
+        <w:tabs>
+          <w:tab w:val="left" w:pos="935"/>
+        </w:tabs>
         <w:spacing w:after="0" w:line="240" w:lineRule="auto"/>
         <w:ind w:left="426"/>
         <w:rPr>
@@ -1246,36 +814,22 @@
           <w:iCs w:val="0"/>
           <w:caps w:val="0"/>
           <w:smallCaps w:val="0"/>
-          <w:noProof w:val="0"/>
-          <w:color w:val="000000" w:themeColor="text1" w:themeTint="FF" w:themeShade="FF"/>
-          <w:sz w:val="26"/>
-          <w:szCs w:val="26"/>
-          <w:lang w:val="en-US"/>
-        </w:rPr>
-      </w:pPr>
-      <w:r>
-        <w:rPr>
-          <w:rFonts w:ascii="Gill Sans MT" w:hAnsi="Gill Sans MT" w:eastAsia="Gill Sans MT" w:cs="Gill Sans MT"/>
-          <w:b w:val="0"/>
-          <w:bCs w:val="0"/>
-          <w:i w:val="0"/>
-          <w:iCs w:val="0"/>
-          <w:caps w:val="0"/>
-          <w:smallCaps w:val="0"/>
-          <w:noProof w:val="0"/>
-          <w:color w:val="000000" w:themeColor="text1" w:themeTint="FF" w:themeShade="FF"/>
-          <w:sz w:val="26"/>
-          <w:szCs w:val="26"/>
-          <w:lang w:val="fr-FR"/>
-        </w:rPr>
-        <w:t xml:space="preserve">La Date de Recrutement : </w:t>
-      </w:r>
-      <w:r>
-        <w:rPr/>
-        <w:t>${recruitment_date}</w:t>
-      </w:r>
-    </w:p>
-    <w:p xmlns:wp14="http://schemas.microsoft.com/office/word/2010/wordml" wp14:paraId="47DB057E" wp14:textId="72A43AE0">
+          <w:color w:val="000000" w:themeColor="text1" w:themeTint="FF" w:themeShade="FF"/>
+          <w:sz w:val="26"/>
+          <w:szCs w:val="26"/>
+        </w:rPr>
+      </w:pPr>
+      <w:r>
+        <w:rPr>
+          <w:rFonts w:ascii="Gill Sans MT" w:hAnsi="Gill Sans MT" w:eastAsia="Gill Sans MT" w:cs="Gill Sans MT"/>
+          <w:color w:val="000000" w:themeColor="text1" w:themeTint="FF" w:themeShade="FF"/>
+          <w:sz w:val="26"/>
+          <w:szCs w:val="26"/>
+        </w:rPr>
+        <w:t>La présente attestation est délivrée à l’intéressée pour servir et valoir ce que de droit./.</w:t>
+      </w:r>
+    </w:p>
+    <w:p>
       <w:pPr>
         <w:spacing w:after="0" w:line="240" w:lineRule="auto"/>
         <w:ind w:left="426"/>
@@ -1287,19 +841,14 @@
           <w:iCs w:val="0"/>
           <w:caps w:val="0"/>
           <w:smallCaps w:val="0"/>
-          <w:noProof w:val="0"/>
-          <w:color w:val="000000" w:themeColor="text1" w:themeTint="FF" w:themeShade="FF"/>
-          <w:sz w:val="26"/>
-          <w:szCs w:val="26"/>
-          <w:lang w:val="en-US"/>
-        </w:rPr>
-      </w:pPr>
-    </w:p>
-    <w:p xmlns:wp14="http://schemas.microsoft.com/office/word/2010/wordml" wp14:paraId="1CAC76CF" wp14:textId="2DDFAC50">
-      <w:pPr>
-        <w:tabs>
-          <w:tab w:val="left" w:leader="none" w:pos="935"/>
-        </w:tabs>
+          <w:color w:val="000000" w:themeColor="text1" w:themeTint="FF" w:themeShade="FF"/>
+          <w:sz w:val="26"/>
+          <w:szCs w:val="26"/>
+        </w:rPr>
+      </w:pPr>
+    </w:p>
+    <w:p>
+      <w:pPr>
         <w:spacing w:after="0" w:line="240" w:lineRule="auto"/>
         <w:ind w:left="426"/>
         <w:rPr>
@@ -1310,72 +859,13 @@
           <w:iCs w:val="0"/>
           <w:caps w:val="0"/>
           <w:smallCaps w:val="0"/>
-          <w:noProof w:val="0"/>
-          <w:color w:val="000000" w:themeColor="text1" w:themeTint="FF" w:themeShade="FF"/>
-          <w:sz w:val="26"/>
-          <w:szCs w:val="26"/>
-          <w:lang w:val="en-US"/>
-        </w:rPr>
-      </w:pPr>
-      <w:r>
-        <w:rPr>
-          <w:rFonts w:ascii="Gill Sans MT" w:hAnsi="Gill Sans MT" w:eastAsia="Gill Sans MT" w:cs="Gill Sans MT"/>
-          <w:b w:val="0"/>
-          <w:bCs w:val="0"/>
-          <w:i w:val="0"/>
-          <w:iCs w:val="0"/>
-          <w:caps w:val="0"/>
-          <w:smallCaps w:val="0"/>
-          <w:noProof w:val="0"/>
-          <w:color w:val="000000" w:themeColor="text1" w:themeTint="FF" w:themeShade="FF"/>
-          <w:sz w:val="26"/>
-          <w:szCs w:val="26"/>
-          <w:lang w:val="fr-FR"/>
-        </w:rPr>
-        <w:t>La présente attestation est délivrée à l’intéressée pour servir et valoir ce que de droit./.</w:t>
-      </w:r>
-    </w:p>
-    <w:p xmlns:wp14="http://schemas.microsoft.com/office/word/2010/wordml" wp14:paraId="085B9A00" wp14:textId="12E9F4C5">
-      <w:pPr>
-        <w:spacing w:after="0" w:line="240" w:lineRule="auto"/>
-        <w:ind w:left="426"/>
-        <w:rPr>
-          <w:rFonts w:ascii="Gill Sans MT" w:hAnsi="Gill Sans MT" w:eastAsia="Gill Sans MT" w:cs="Gill Sans MT"/>
-          <w:b w:val="0"/>
-          <w:bCs w:val="0"/>
-          <w:i w:val="0"/>
-          <w:iCs w:val="0"/>
-          <w:caps w:val="0"/>
-          <w:smallCaps w:val="0"/>
-          <w:noProof w:val="0"/>
-          <w:color w:val="000000" w:themeColor="text1" w:themeTint="FF" w:themeShade="FF"/>
-          <w:sz w:val="26"/>
-          <w:szCs w:val="26"/>
-          <w:lang w:val="en-US"/>
-        </w:rPr>
-      </w:pPr>
-    </w:p>
-    <w:p xmlns:wp14="http://schemas.microsoft.com/office/word/2010/wordml" wp14:paraId="66CAB5B9" wp14:textId="52E3C236">
-      <w:pPr>
-        <w:spacing w:after="0" w:line="240" w:lineRule="auto"/>
-        <w:ind w:left="426"/>
-        <w:rPr>
-          <w:rFonts w:ascii="Gill Sans MT" w:hAnsi="Gill Sans MT" w:eastAsia="Gill Sans MT" w:cs="Gill Sans MT"/>
-          <w:b w:val="0"/>
-          <w:bCs w:val="0"/>
-          <w:i w:val="0"/>
-          <w:iCs w:val="0"/>
-          <w:caps w:val="0"/>
-          <w:smallCaps w:val="0"/>
-          <w:noProof w:val="0"/>
-          <w:color w:val="000000" w:themeColor="text1" w:themeTint="FF" w:themeShade="FF"/>
-          <w:sz w:val="26"/>
-          <w:szCs w:val="26"/>
-          <w:lang w:val="en-US"/>
-        </w:rPr>
-      </w:pPr>
-    </w:p>
-    <w:p xmlns:wp14="http://schemas.microsoft.com/office/word/2010/wordml" wp14:paraId="05FC50C9" wp14:textId="7CCD0AC8">
+          <w:color w:val="000000" w:themeColor="text1" w:themeTint="FF" w:themeShade="FF"/>
+          <w:sz w:val="26"/>
+          <w:szCs w:val="26"/>
+        </w:rPr>
+      </w:pPr>
+    </w:p>
+    <w:p>
       <w:pPr>
         <w:spacing w:after="200" w:line="276" w:lineRule="auto"/>
         <w:rPr>
@@ -1386,15 +876,13 @@
           <w:iCs w:val="0"/>
           <w:caps w:val="0"/>
           <w:smallCaps w:val="0"/>
-          <w:noProof w:val="0"/>
           <w:color w:val="000000" w:themeColor="text1" w:themeTint="FF" w:themeShade="FF"/>
           <w:sz w:val="22"/>
           <w:szCs w:val="22"/>
-          <w:lang w:val="en-US"/>
-        </w:rPr>
-      </w:pPr>
-    </w:p>
-    <w:p xmlns:wp14="http://schemas.microsoft.com/office/word/2010/wordml" wp14:paraId="553881E7" wp14:textId="7A5EE0B1">
+        </w:rPr>
+      </w:pPr>
+    </w:p>
+    <w:p>
       <w:pPr>
         <w:spacing w:after="200" w:line="276" w:lineRule="auto"/>
         <w:rPr>
@@ -1405,15 +893,13 @@
           <w:iCs w:val="0"/>
           <w:caps w:val="0"/>
           <w:smallCaps w:val="0"/>
-          <w:noProof w:val="0"/>
           <w:color w:val="000000" w:themeColor="text1" w:themeTint="FF" w:themeShade="FF"/>
           <w:sz w:val="22"/>
           <w:szCs w:val="22"/>
-          <w:lang w:val="en-US"/>
-        </w:rPr>
-      </w:pPr>
-    </w:p>
-    <w:p xmlns:wp14="http://schemas.microsoft.com/office/word/2010/wordml" wp14:paraId="2DF4B290" wp14:textId="4E88B096">
+        </w:rPr>
+      </w:pPr>
+    </w:p>
+    <w:p>
       <w:pPr>
         <w:spacing w:after="0" w:line="276" w:lineRule="auto"/>
         <w:ind w:left="5664" w:firstLine="708"/>
@@ -1425,32 +911,24 @@
           <w:iCs w:val="0"/>
           <w:caps w:val="0"/>
           <w:smallCaps w:val="0"/>
-          <w:noProof w:val="0"/>
           <w:color w:val="000000" w:themeColor="text1" w:themeTint="FF" w:themeShade="FF"/>
           <w:sz w:val="28"/>
           <w:szCs w:val="28"/>
-          <w:lang w:val="en-US"/>
-        </w:rPr>
-      </w:pPr>
-      <w:r>
-        <w:rPr>
-          <w:rFonts w:ascii="Gill Sans MT" w:hAnsi="Gill Sans MT" w:eastAsia="Gill Sans MT" w:cs="Gill Sans MT"/>
-          <w:b w:val="0"/>
-          <w:bCs w:val="0"/>
-          <w:i w:val="1"/>
-          <w:iCs w:val="1"/>
-          <w:caps w:val="0"/>
-          <w:smallCaps w:val="0"/>
-          <w:noProof w:val="0"/>
+        </w:rPr>
+      </w:pPr>
+      <w:r>
+        <w:rPr>
+          <w:rFonts w:ascii="Gill Sans MT" w:hAnsi="Gill Sans MT" w:eastAsia="Gill Sans MT" w:cs="Gill Sans MT"/>
+          <w:i/>
+          <w:iCs/>
           <w:color w:val="000000" w:themeColor="text1" w:themeTint="FF" w:themeShade="FF"/>
           <w:sz w:val="28"/>
           <w:szCs w:val="28"/>
-          <w:lang w:val="fr-FR"/>
         </w:rPr>
         <w:t>Directeur Régional PI</w:t>
       </w:r>
     </w:p>
-    <w:p xmlns:wp14="http://schemas.microsoft.com/office/word/2010/wordml" wp14:paraId="601AF4EB" wp14:textId="01B91AEB">
+    <w:p>
       <w:pPr>
         <w:spacing w:after="0" w:line="276" w:lineRule="auto"/>
         <w:ind w:left="5664"/>
@@ -1462,32 +940,24 @@
           <w:iCs w:val="0"/>
           <w:caps w:val="0"/>
           <w:smallCaps w:val="0"/>
-          <w:noProof w:val="0"/>
           <w:color w:val="000000" w:themeColor="text1" w:themeTint="FF" w:themeShade="FF"/>
           <w:sz w:val="28"/>
           <w:szCs w:val="28"/>
-          <w:lang w:val="en-US"/>
-        </w:rPr>
-      </w:pPr>
-      <w:r>
-        <w:rPr>
-          <w:rFonts w:ascii="Gill Sans MT" w:hAnsi="Gill Sans MT" w:eastAsia="Gill Sans MT" w:cs="Gill Sans MT"/>
-          <w:b w:val="0"/>
-          <w:bCs w:val="0"/>
-          <w:i w:val="1"/>
-          <w:iCs w:val="1"/>
-          <w:caps w:val="0"/>
-          <w:smallCaps w:val="0"/>
-          <w:noProof w:val="0"/>
+        </w:rPr>
+      </w:pPr>
+      <w:r>
+        <w:rPr>
+          <w:rFonts w:ascii="Gill Sans MT" w:hAnsi="Gill Sans MT" w:eastAsia="Gill Sans MT" w:cs="Gill Sans MT"/>
+          <w:i/>
+          <w:iCs/>
           <w:color w:val="000000" w:themeColor="text1" w:themeTint="FF" w:themeShade="FF"/>
           <w:sz w:val="28"/>
           <w:szCs w:val="28"/>
-          <w:lang w:val="fr-FR"/>
         </w:rPr>
         <w:t xml:space="preserve">        EL ABBASSI Marouane</w:t>
       </w:r>
     </w:p>
-    <w:p xmlns:wp14="http://schemas.microsoft.com/office/word/2010/wordml" wp14:paraId="7459F365" wp14:textId="79E0CAF0">
+    <w:p>
       <w:pPr>
         <w:spacing w:after="0" w:line="276" w:lineRule="auto"/>
         <w:ind w:left="4674"/>
@@ -1500,32 +970,24 @@
           <w:iCs w:val="0"/>
           <w:caps w:val="0"/>
           <w:smallCaps w:val="0"/>
-          <w:noProof w:val="0"/>
           <w:color w:val="000000" w:themeColor="text1" w:themeTint="FF" w:themeShade="FF"/>
           <w:sz w:val="28"/>
           <w:szCs w:val="28"/>
-          <w:lang w:val="en-US"/>
-        </w:rPr>
-      </w:pPr>
-      <w:r>
-        <w:rPr>
-          <w:rFonts w:ascii="Gill Sans MT" w:hAnsi="Gill Sans MT" w:eastAsia="Gill Sans MT" w:cs="Gill Sans MT"/>
-          <w:b w:val="0"/>
-          <w:bCs w:val="0"/>
-          <w:i w:val="1"/>
-          <w:iCs w:val="1"/>
-          <w:caps w:val="0"/>
-          <w:smallCaps w:val="0"/>
-          <w:noProof w:val="0"/>
+        </w:rPr>
+      </w:pPr>
+      <w:r>
+        <w:rPr>
+          <w:rFonts w:ascii="Gill Sans MT" w:hAnsi="Gill Sans MT" w:eastAsia="Gill Sans MT" w:cs="Gill Sans MT"/>
+          <w:i/>
+          <w:iCs/>
           <w:color w:val="000000" w:themeColor="text1" w:themeTint="FF" w:themeShade="FF"/>
           <w:sz w:val="28"/>
           <w:szCs w:val="28"/>
-          <w:lang w:val="fr-FR"/>
         </w:rPr>
         <w:t xml:space="preserve">   </w:t>
       </w:r>
     </w:p>
-    <w:p xmlns:wp14="http://schemas.microsoft.com/office/word/2010/wordml" wp14:paraId="3C1C164A" wp14:textId="42DC551A">
+    <w:p>
       <w:pPr>
         <w:spacing w:after="200" w:line="276" w:lineRule="auto"/>
         <w:rPr>
@@ -1536,31 +998,32 @@
           <w:iCs w:val="0"/>
           <w:caps w:val="0"/>
           <w:smallCaps w:val="0"/>
-          <w:noProof w:val="0"/>
           <w:color w:val="000000" w:themeColor="text1" w:themeTint="FF" w:themeShade="FF"/>
           <w:sz w:val="22"/>
           <w:szCs w:val="22"/>
-          <w:lang w:val="en-US"/>
-        </w:rPr>
-      </w:pPr>
-    </w:p>
-    <w:p xmlns:wp14="http://schemas.microsoft.com/office/word/2010/wordml" wp14:paraId="6F597D81" wp14:textId="2B2E59AA">
+        </w:rPr>
+      </w:pPr>
+    </w:p>
+    <w:p>
       <w:pPr>
         <w:tabs>
-          <w:tab w:val="center" w:leader="none" w:pos="4536"/>
-          <w:tab w:val="right" w:leader="none" w:pos="9072"/>
+          <w:tab w:val="center" w:pos="4536"/>
+          <w:tab w:val="right" w:pos="9072"/>
         </w:tabs>
         <w:spacing w:after="0" w:line="240" w:lineRule="auto"/>
       </w:pPr>
     </w:p>
-    <w:p xmlns:wp14="http://schemas.microsoft.com/office/word/2010/wordml" wp14:paraId="2C078E63" wp14:textId="04A82AF9"/>
+    <w:p>
+      <w:pPr>
+        <w:spacing w:after="160" w:line="279" w:lineRule="auto"/>
+      </w:pPr>
+    </w:p>
     <w:sectPr>
-      <w:pgSz w:w="11907" w:h="16839" w:orient="portrait"/>
-      <w:pgMar w:top="1417" w:right="709" w:bottom="1417" w:left="1417" w:header="720" w:footer="720" w:gutter="0"/>
-      <w:cols w:space="720"/>
-      <w:docGrid w:linePitch="360"/>
       <w:headerReference w:type="default" r:id="Rf1b8600f161e4e8c"/>
       <w:footerReference w:type="default" r:id="R9e385df1ad7242f0"/>
+      <w:pgSz w:w="11907" w:h="16839"/>
+      <w:pgMar w:top="1417" w:right="709" w:bottom="1417" w:left="1417" w:header="720" w:footer="720" w:gutter="0"/>
+      <w:docGrid w:linePitch="360"/>
     </w:sectPr>
   </w:body>
 </w:document>

</xml_diff>

<commit_message>
feat: add employee module and improve document generation
- add Employee model and factory
- rename and organize seeders
- update document templates
- improve document generation service
- support dynamic select fields
- update form rendering
</commit_message>
<xml_diff>
--- a/backend/storage/app/templates/attestation_travail.docx
+++ b/backend/storage/app/templates/attestation_travail.docx
@@ -1,17 +1,14 @@
 
 <file path=word/document.xml><?xml version="1.0" encoding="utf-8"?>
-<w:document xmlns:wpc="http://schemas.microsoft.com/office/word/2010/wordprocessingCanvas" xmlns:cx="http://schemas.microsoft.com/office/drawing/2014/chartex" xmlns:cx1="http://schemas.microsoft.com/office/drawing/2015/9/8/chartex" xmlns:cx2="http://schemas.microsoft.com/office/drawing/2015/10/21/chartex" xmlns:cx3="http://schemas.microsoft.com/office/drawing/2016/5/9/chartex" xmlns:cx4="http://schemas.microsoft.com/office/drawing/2016/5/10/chartex" xmlns:cx5="http://schemas.microsoft.com/office/drawing/2016/5/11/chartex" xmlns:cx6="http://schemas.microsoft.com/office/drawing/2016/5/12/chartex" xmlns:cx7="http://schemas.microsoft.com/office/drawing/2016/5/13/chartex" xmlns:cx8="http://schemas.microsoft.com/office/drawing/2016/5/14/chartex" xmlns:mc="http://schemas.openxmlformats.org/markup-compatibility/2006" xmlns:aink="http://schemas.microsoft.com/office/drawing/2016/ink" xmlns:am3d="http://schemas.microsoft.com/office/drawing/2017/model3d" xmlns:o="urn:schemas-microsoft-com:office:office" xmlns:oel="http://schemas.microsoft.com/office/2019/extlst" xmlns:r="http://schemas.openxmlformats.org/officeDocument/2006/relationships" xmlns:m="http://schemas.openxmlformats.org/officeDocument/2006/math" xmlns:v="urn:schemas-microsoft-com:vml" xmlns:wp14="http://schemas.microsoft.com/office/word/2010/wordprocessingDrawing" xmlns:wp="http://schemas.openxmlformats.org/drawingml/2006/wordprocessingDrawing" xmlns:w10="urn:schemas-microsoft-com:office:word" xmlns:w="http://schemas.openxmlformats.org/wordprocessingml/2006/main" xmlns:w14="http://schemas.microsoft.com/office/word/2010/wordml" xmlns:w15="http://schemas.microsoft.com/office/word/2012/wordml" xmlns:w16cex="http://schemas.microsoft.com/office/word/2018/wordml/cex" xmlns:w16cid="http://schemas.microsoft.com/office/word/2016/wordml/cid" xmlns:w16="http://schemas.microsoft.com/office/word/2018/wordml" xmlns:w16du="http://schemas.microsoft.com/office/word/2023/wordml/word16du" xmlns:w16sdtdh="http://schemas.microsoft.com/office/word/2020/wordml/sdtdatahash" xmlns:w16sdtfl="http://schemas.microsoft.com/office/word/2024/wordml/sdtformatlock" xmlns:w16se="http://schemas.microsoft.com/office/word/2015/wordml/symex" xmlns:wpg="http://schemas.microsoft.com/office/word/2010/wordprocessingGroup" xmlns:wpi="http://schemas.microsoft.com/office/word/2010/wordprocessingInk" xmlns:wne="http://schemas.microsoft.com/office/word/2006/wordml" xmlns:wps="http://schemas.microsoft.com/office/word/2010/wordprocessingShape" mc:Ignorable="w14 w15 w16se w16cid w16 w16cex w16sdtdh w16sdtfl w16du wp14">
+<w:document xmlns:wpc="http://schemas.microsoft.com/office/word/2010/wordprocessingCanvas" xmlns:mc="http://schemas.openxmlformats.org/markup-compatibility/2006" xmlns:o="urn:schemas-microsoft-com:office:office" xmlns:r="http://schemas.openxmlformats.org/officeDocument/2006/relationships" xmlns:m="http://schemas.openxmlformats.org/officeDocument/2006/math" xmlns:v="urn:schemas-microsoft-com:vml" xmlns:wp14="http://schemas.microsoft.com/office/word/2010/wordprocessingDrawing" xmlns:wp="http://schemas.openxmlformats.org/drawingml/2006/wordprocessingDrawing" xmlns:w10="urn:schemas-microsoft-com:office:word" xmlns:w="http://schemas.openxmlformats.org/wordprocessingml/2006/main" xmlns:w14="http://schemas.microsoft.com/office/word/2010/wordml" xmlns:w15="http://schemas.microsoft.com/office/word/2012/wordml" xmlns:w16se="http://schemas.microsoft.com/office/word/2015/wordml/symex" xmlns:w16cid="http://schemas.microsoft.com/office/word/2016/wordml/cid" xmlns:w16="http://schemas.microsoft.com/office/word/2018/wordml" xmlns:w16cex="http://schemas.microsoft.com/office/word/2018/wordml/cex" xmlns:w16sdtdh="http://schemas.microsoft.com/office/word/2020/wordml/sdtdatahash" xmlns:wne="http://schemas.microsoft.com/office/word/2006/wordml" xmlns:wpg="http://schemas.microsoft.com/office/word/2010/wordprocessingGroup" xmlns:wps="http://schemas.microsoft.com/office/word/2010/wordprocessingShape" mc:Ignorable="w14 w15 w16se w16cid w16 w16cex w16sdtdh wp14">
   <w:body>
     <w:p>
       <w:pPr>
         <w:spacing w:after="0" w:line="240" w:lineRule="auto"/>
       </w:pPr>
       <w:r>
-        <w:rPr>
-          <w:noProof/>
-        </w:rPr>
         <w:drawing>
-          <wp:anchor distT="0" distB="0" distL="114300" distR="114300" simplePos="0" relativeHeight="251658240" behindDoc="0" locked="0" layoutInCell="1" allowOverlap="1" wp14:anchorId="1FBB6C2B" wp14:editId="2EA04A3E">
+          <wp:anchor distT="0" distB="0" distL="114300" distR="114300" simplePos="0" relativeHeight="251658240" behindDoc="0" locked="0" layoutInCell="1" allowOverlap="1">
             <wp:simplePos x="0" y="0"/>
             <wp:positionH relativeFrom="column">
               <wp:posOffset>4648200</wp:posOffset>
@@ -22,7 +19,7 @@
             <wp:extent cx="723900" cy="571500"/>
             <wp:effectExtent l="0" t="0" r="0" b="0"/>
             <wp:wrapNone/>
-            <wp:docPr id="1334480110" name="drawing"/>
+            <wp:docPr id="100000" name="Picture 100000"/>
             <wp:cNvGraphicFramePr>
               <a:graphicFrameLocks xmlns:a="http://schemas.openxmlformats.org/drawingml/2006/main" noChangeAspect="1"/>
             </wp:cNvGraphicFramePr>
@@ -30,17 +27,11 @@
               <a:graphicData uri="http://schemas.openxmlformats.org/drawingml/2006/picture">
                 <pic:pic xmlns:pic="http://schemas.openxmlformats.org/drawingml/2006/picture">
                   <pic:nvPicPr>
-                    <pic:cNvPr id="501944396" name="Picture 501944396"/>
+                    <pic:cNvPr id="100000" name="image100000"/>
                     <pic:cNvPicPr/>
                   </pic:nvPicPr>
                   <pic:blipFill>
-                    <a:blip r:embed="rId6">
-                      <a:extLst>
-                        <a:ext uri="{28A0092B-C50C-407E-A947-70E740481C1C}">
-                          <a14:useLocalDpi xmlns:a14="http://schemas.microsoft.com/office/drawing/2010/main"/>
-                        </a:ext>
-                      </a:extLst>
-                    </a:blip>
+                    <a:blip r:embed="rId12"/>
                     <a:stretch>
                       <a:fillRect/>
                     </a:stretch>
@@ -57,21 +48,12 @@
                 </pic:pic>
               </a:graphicData>
             </a:graphic>
-            <wp14:sizeRelH relativeFrom="page">
-              <wp14:pctWidth>0</wp14:pctWidth>
-            </wp14:sizeRelH>
-            <wp14:sizeRelV relativeFrom="page">
-              <wp14:pctHeight>0</wp14:pctHeight>
-            </wp14:sizeRelV>
           </wp:anchor>
         </w:drawing>
       </w:r>
       <w:r>
-        <w:rPr>
-          <w:noProof/>
-        </w:rPr>
         <w:drawing>
-          <wp:anchor distT="0" distB="0" distL="114300" distR="114300" simplePos="0" relativeHeight="251657216" behindDoc="0" locked="0" layoutInCell="1" allowOverlap="1" wp14:anchorId="481C8BFA" wp14:editId="78FA39E8">
+          <wp:anchor distT="0" distB="0" distL="114300" distR="114300" simplePos="0" relativeHeight="251658240" behindDoc="0" locked="0" layoutInCell="1" allowOverlap="1">
             <wp:simplePos x="0" y="0"/>
             <wp:positionH relativeFrom="column">
               <wp:posOffset>-47625</wp:posOffset>
@@ -82,7 +64,7 @@
             <wp:extent cx="2038350" cy="628650"/>
             <wp:effectExtent l="0" t="0" r="0" b="0"/>
             <wp:wrapNone/>
-            <wp:docPr id="922366770" name="drawing"/>
+            <wp:docPr id="100001" name="Picture 100001"/>
             <wp:cNvGraphicFramePr>
               <a:graphicFrameLocks xmlns:a="http://schemas.openxmlformats.org/drawingml/2006/main" noChangeAspect="1"/>
             </wp:cNvGraphicFramePr>
@@ -90,17 +72,11 @@
               <a:graphicData uri="http://schemas.openxmlformats.org/drawingml/2006/picture">
                 <pic:pic xmlns:pic="http://schemas.openxmlformats.org/drawingml/2006/picture">
                   <pic:nvPicPr>
-                    <pic:cNvPr id="1386879043" name="Picture 1386879043"/>
+                    <pic:cNvPr id="100001" name="image100001"/>
                     <pic:cNvPicPr/>
                   </pic:nvPicPr>
                   <pic:blipFill>
-                    <a:blip r:embed="rId7">
-                      <a:extLst>
-                        <a:ext uri="{28A0092B-C50C-407E-A947-70E740481C1C}">
-                          <a14:useLocalDpi xmlns:a14="http://schemas.microsoft.com/office/drawing/2010/main"/>
-                        </a:ext>
-                      </a:extLst>
-                    </a:blip>
+                    <a:blip r:embed="rId13"/>
                     <a:stretch>
                       <a:fillRect/>
                     </a:stretch>
@@ -117,12 +93,6 @@
                 </pic:pic>
               </a:graphicData>
             </a:graphic>
-            <wp14:sizeRelH relativeFrom="page">
-              <wp14:pctWidth>0</wp14:pctWidth>
-            </wp14:sizeRelH>
-            <wp14:sizeRelV relativeFrom="page">
-              <wp14:pctHeight>0</wp14:pctHeight>
-            </wp14:sizeRelV>
           </wp:anchor>
         </w:drawing>
       </w:r>
@@ -131,110 +101,45 @@
       <w:pPr>
         <w:spacing w:after="0" w:line="240" w:lineRule="auto"/>
         <w:rPr>
-          <w:rFonts w:ascii="Gill Sans MT" w:eastAsia="Gill Sans MT" w:hAnsi="Gill Sans MT" w:cs="Gill Sans MT"/>
-          <w:color w:val="000000" w:themeColor="text1"/>
-        </w:rPr>
-      </w:pPr>
-      <w:proofErr w:type="spellStart"/>
-      <w:r>
-        <w:rPr>
-          <w:rFonts w:ascii="Gill Sans MT" w:eastAsia="Gill Sans MT" w:hAnsi="Gill Sans MT" w:cs="Gill Sans MT"/>
+          <w:rFonts w:ascii="Gill Sans MT" w:hAnsi="Gill Sans MT" w:eastAsia="Gill Sans MT" w:cs="Gill Sans MT"/>
+          <w:color w:val="000000" w:themeColor="text1"/>
+        </w:rPr>
+      </w:pPr>
+      <w:r>
+        <w:rPr>
+          <w:rFonts w:ascii="Gill Sans MT" w:hAnsi="Gill Sans MT" w:eastAsia="Gill Sans MT" w:cs="Gill Sans MT"/>
           <w:i/>
           <w:iCs/>
           <w:color w:val="000000" w:themeColor="text1"/>
-        </w:rPr>
-        <w:t>Réf</w:t>
-      </w:r>
-      <w:proofErr w:type="spellEnd"/>
-      <w:r>
-        <w:rPr>
-          <w:rFonts w:ascii="Gill Sans MT" w:eastAsia="Gill Sans MT" w:hAnsi="Gill Sans MT" w:cs="Gill Sans MT"/>
+          <w:sz w:val="20"/>
+          <w:szCs w:val="20"/>
+        </w:rPr>
+        <w:t>Réf : OFP/DRBMK/CMCBMK-AT/N° ${ref}/26</w:t>
+      </w:r>
+      <w:r>
+        <w:tab/>
+      </w:r>
+      <w:r>
+        <w:tab/>
+      </w:r>
+      <w:r>
+        <w:rPr>
+          <w:rFonts w:ascii="Gill Sans MT" w:hAnsi="Gill Sans MT" w:eastAsia="Gill Sans MT" w:cs="Gill Sans MT"/>
           <w:i/>
           <w:iCs/>
           <w:color w:val="000000" w:themeColor="text1"/>
-        </w:rPr>
-        <w:t xml:space="preserve"> : OFP/DRBMK/CMCBMK-AT/N° </w:t>
-      </w:r>
-      <w:r>
-        <w:rPr>
-          <w:rFonts w:ascii="Gill Sans MT" w:eastAsia="Gill Sans MT" w:hAnsi="Gill Sans MT" w:cs="Gill Sans MT"/>
-          <w:i/>
-          <w:iCs/>
-          <w:color w:val="000000" w:themeColor="text1"/>
-        </w:rPr>
-        <w:t>${ref}</w:t>
-      </w:r>
-      <w:r>
-        <w:rPr>
-          <w:rFonts w:ascii="Gill Sans MT" w:eastAsia="Gill Sans MT" w:hAnsi="Gill Sans MT" w:cs="Gill Sans MT"/>
-          <w:i/>
-          <w:iCs/>
-          <w:color w:val="000000" w:themeColor="text1"/>
-        </w:rPr>
-        <w:t>/26</w:t>
-      </w:r>
-      <w:r>
-        <w:tab/>
-      </w:r>
-      <w:r>
-        <w:tab/>
-      </w:r>
-      <w:r>
-        <w:rPr>
-          <w:rFonts w:ascii="Gill Sans MT" w:eastAsia="Gill Sans MT" w:hAnsi="Gill Sans MT" w:cs="Gill Sans MT"/>
-          <w:i/>
-          <w:iCs/>
-          <w:color w:val="000000" w:themeColor="text1"/>
-        </w:rPr>
-        <w:t xml:space="preserve">                               Béni </w:t>
-      </w:r>
-      <w:proofErr w:type="spellStart"/>
-      <w:r>
-        <w:rPr>
-          <w:rFonts w:ascii="Gill Sans MT" w:eastAsia="Gill Sans MT" w:hAnsi="Gill Sans MT" w:cs="Gill Sans MT"/>
-          <w:i/>
-          <w:iCs/>
-          <w:color w:val="000000" w:themeColor="text1"/>
-        </w:rPr>
-        <w:t>Mellal,le</w:t>
-      </w:r>
-      <w:proofErr w:type="spellEnd"/>
-      <w:r>
-        <w:rPr>
-          <w:rFonts w:ascii="Gill Sans MT" w:eastAsia="Gill Sans MT" w:hAnsi="Gill Sans MT" w:cs="Gill Sans MT"/>
-          <w:i/>
-          <w:iCs/>
-          <w:color w:val="000000" w:themeColor="text1"/>
-        </w:rPr>
-        <w:t>${</w:t>
-      </w:r>
-      <w:proofErr w:type="spellStart"/>
-      <w:r>
-        <w:rPr>
-          <w:rFonts w:ascii="Gill Sans MT" w:eastAsia="Gill Sans MT" w:hAnsi="Gill Sans MT" w:cs="Gill Sans MT"/>
-          <w:i/>
-          <w:iCs/>
-          <w:color w:val="000000" w:themeColor="text1"/>
-        </w:rPr>
-        <w:t>current_date</w:t>
-      </w:r>
-      <w:proofErr w:type="spellEnd"/>
-      <w:r>
-        <w:rPr>
-          <w:rFonts w:ascii="Gill Sans MT" w:eastAsia="Gill Sans MT" w:hAnsi="Gill Sans MT" w:cs="Gill Sans MT"/>
-          <w:i/>
-          <w:iCs/>
-          <w:color w:val="000000" w:themeColor="text1"/>
-        </w:rPr>
-        <w:t>}</w:t>
-      </w:r>
-    </w:p>
-    <w:p>
-      <w:pPr>
-        <w:spacing w:after="0" w:line="240" w:lineRule="auto"/>
-        <w:ind w:left="426"/>
-        <w:rPr>
-          <w:rFonts w:ascii="Gill Sans MT" w:eastAsia="Gill Sans MT" w:hAnsi="Gill Sans MT" w:cs="Gill Sans MT"/>
+          <w:sz w:val="20"/>
+          <w:szCs w:val="20"/>
+        </w:rPr>
+        <w:t xml:space="preserve">                               Béni Mellal,le${current_date}</w:t>
+      </w:r>
+    </w:p>
+    <w:p>
+      <w:pPr>
+        <w:spacing w:after="0" w:line="240" w:lineRule="auto"/>
+        <w:ind w:left="426"/>
+        <w:rPr>
+          <w:rFonts w:ascii="Gill Sans MT" w:hAnsi="Gill Sans MT" w:eastAsia="Gill Sans MT" w:cs="Gill Sans MT"/>
           <w:color w:val="000000" w:themeColor="text1"/>
           <w:sz w:val="32"/>
           <w:szCs w:val="32"/>
@@ -246,7 +151,7 @@
         <w:spacing w:after="0" w:line="240" w:lineRule="auto"/>
         <w:ind w:left="426"/>
         <w:rPr>
-          <w:rFonts w:ascii="Gill Sans MT" w:eastAsia="Gill Sans MT" w:hAnsi="Gill Sans MT" w:cs="Gill Sans MT"/>
+          <w:rFonts w:ascii="Gill Sans MT" w:hAnsi="Gill Sans MT" w:eastAsia="Gill Sans MT" w:cs="Gill Sans MT"/>
           <w:color w:val="000000" w:themeColor="text1"/>
           <w:sz w:val="32"/>
           <w:szCs w:val="32"/>
@@ -258,7 +163,7 @@
         <w:spacing w:after="0" w:line="240" w:lineRule="auto"/>
         <w:ind w:left="426"/>
         <w:rPr>
-          <w:rFonts w:ascii="Gill Sans MT" w:eastAsia="Gill Sans MT" w:hAnsi="Gill Sans MT" w:cs="Gill Sans MT"/>
+          <w:rFonts w:ascii="Gill Sans MT" w:hAnsi="Gill Sans MT" w:eastAsia="Gill Sans MT" w:cs="Gill Sans MT"/>
           <w:color w:val="000000" w:themeColor="text1"/>
           <w:sz w:val="32"/>
           <w:szCs w:val="32"/>
@@ -268,21 +173,20 @@
     <w:p>
       <w:pPr>
         <w:keepNext/>
-        <w:shd w:val="clear" w:color="auto" w:fill="FFFFFF" w:themeFill="background1"/>
+        <w:shd w:val="clear" w:fill="FFFFFF" w:themeFill="background1"/>
         <w:spacing w:after="0" w:line="240" w:lineRule="auto"/>
         <w:ind w:left="426" w:right="538"/>
         <w:jc w:val="center"/>
         <w:rPr>
-          <w:rFonts w:ascii="Gill Sans MT" w:eastAsia="Gill Sans MT" w:hAnsi="Gill Sans MT" w:cs="Gill Sans MT"/>
+          <w:rFonts w:ascii="Gill Sans MT" w:hAnsi="Gill Sans MT" w:eastAsia="Gill Sans MT" w:cs="Gill Sans MT"/>
           <w:color w:val="000000" w:themeColor="text1"/>
           <w:sz w:val="36"/>
           <w:szCs w:val="36"/>
-          <w:lang w:val="fr-FR"/>
-        </w:rPr>
-      </w:pPr>
-      <w:r>
-        <w:rPr>
-          <w:rFonts w:ascii="Gill Sans MT" w:eastAsia="Gill Sans MT" w:hAnsi="Gill Sans MT" w:cs="Gill Sans MT"/>
+        </w:rPr>
+      </w:pPr>
+      <w:r>
+        <w:rPr>
+          <w:rFonts w:ascii="Gill Sans MT" w:hAnsi="Gill Sans MT" w:eastAsia="Gill Sans MT" w:cs="Gill Sans MT"/>
           <w:b/>
           <w:bCs/>
           <w:i/>
@@ -290,7 +194,6 @@
           <w:color w:val="000000" w:themeColor="text1"/>
           <w:sz w:val="36"/>
           <w:szCs w:val="36"/>
-          <w:lang w:val="fr-FR"/>
         </w:rPr>
         <w:t>ATTESTATION DE TRAVAIL</w:t>
       </w:r>
@@ -300,9 +203,8 @@
         <w:spacing w:after="0" w:line="240" w:lineRule="auto"/>
         <w:ind w:left="426"/>
         <w:rPr>
-          <w:rFonts w:ascii="Gill Sans MT" w:eastAsia="Gill Sans MT" w:hAnsi="Gill Sans MT" w:cs="Gill Sans MT"/>
-          <w:color w:val="000000" w:themeColor="text1"/>
-          <w:lang w:val="fr-FR"/>
+          <w:rFonts w:ascii="Gill Sans MT" w:hAnsi="Gill Sans MT" w:eastAsia="Gill Sans MT" w:cs="Gill Sans MT"/>
+          <w:color w:val="000000" w:themeColor="text1"/>
         </w:rPr>
       </w:pPr>
     </w:p>
@@ -310,180 +212,153 @@
       <w:pPr>
         <w:spacing w:after="200" w:line="276" w:lineRule="auto"/>
         <w:rPr>
-          <w:rFonts w:ascii="Calibri" w:eastAsia="Calibri" w:hAnsi="Calibri" w:cs="Calibri"/>
+          <w:rFonts w:ascii="Calibri" w:hAnsi="Calibri" w:eastAsia="Calibri" w:cs="Calibri"/>
           <w:color w:val="000000" w:themeColor="text1"/>
           <w:sz w:val="22"/>
           <w:szCs w:val="22"/>
-          <w:lang w:val="fr-FR"/>
-        </w:rPr>
-      </w:pPr>
-    </w:p>
-    <w:p>
-      <w:pPr>
-        <w:spacing w:after="200" w:line="276" w:lineRule="auto"/>
-        <w:rPr>
-          <w:rFonts w:ascii="Calibri" w:eastAsia="Calibri" w:hAnsi="Calibri" w:cs="Calibri"/>
-          <w:color w:val="000000" w:themeColor="text1"/>
-          <w:sz w:val="22"/>
-          <w:szCs w:val="22"/>
-          <w:lang w:val="fr-FR"/>
-        </w:rPr>
-      </w:pPr>
-    </w:p>
-    <w:p>
-      <w:pPr>
-        <w:spacing w:after="0" w:line="240" w:lineRule="auto"/>
-        <w:ind w:left="426"/>
-        <w:rPr>
-          <w:rFonts w:ascii="Gill Sans MT" w:eastAsia="Gill Sans MT" w:hAnsi="Gill Sans MT" w:cs="Gill Sans MT"/>
-          <w:color w:val="000000" w:themeColor="text1"/>
-          <w:sz w:val="26"/>
-          <w:szCs w:val="26"/>
-          <w:lang w:val="fr-FR"/>
-        </w:rPr>
-      </w:pPr>
-    </w:p>
-    <w:p>
-      <w:pPr>
-        <w:spacing w:after="0" w:line="240" w:lineRule="auto"/>
-        <w:ind w:left="426"/>
-        <w:rPr>
-          <w:rFonts w:ascii="Gill Sans MT" w:eastAsia="Gill Sans MT" w:hAnsi="Gill Sans MT" w:cs="Gill Sans MT"/>
-          <w:color w:val="000000" w:themeColor="text1"/>
-          <w:sz w:val="26"/>
-          <w:szCs w:val="26"/>
-          <w:lang w:val="fr-FR"/>
-        </w:rPr>
-      </w:pPr>
-      <w:r>
-        <w:rPr>
-          <w:rFonts w:ascii="Gill Sans MT" w:eastAsia="Gill Sans MT" w:hAnsi="Gill Sans MT" w:cs="Gill Sans MT"/>
+        </w:rPr>
+      </w:pPr>
+    </w:p>
+    <w:p>
+      <w:pPr>
+        <w:spacing w:after="0" w:line="240" w:lineRule="auto"/>
+        <w:ind w:left="426"/>
+        <w:rPr>
+          <w:rFonts w:ascii="Gill Sans MT" w:hAnsi="Gill Sans MT" w:eastAsia="Gill Sans MT" w:cs="Gill Sans MT"/>
+          <w:color w:val="000000" w:themeColor="text1"/>
+          <w:sz w:val="26"/>
+          <w:szCs w:val="26"/>
+        </w:rPr>
+      </w:pPr>
+    </w:p>
+    <w:p>
+      <w:pPr>
+        <w:spacing w:after="0" w:line="240" w:lineRule="auto"/>
+        <w:ind w:left="426"/>
+        <w:rPr>
+          <w:rFonts w:ascii="Gill Sans MT" w:hAnsi="Gill Sans MT" w:eastAsia="Gill Sans MT" w:cs="Gill Sans MT"/>
+          <w:color w:val="000000" w:themeColor="text1"/>
+          <w:sz w:val="26"/>
+          <w:szCs w:val="26"/>
+        </w:rPr>
+      </w:pPr>
+      <w:r>
+        <w:rPr>
+          <w:rFonts w:ascii="Gill Sans MT" w:hAnsi="Gill Sans MT" w:eastAsia="Gill Sans MT" w:cs="Gill Sans MT"/>
           <w:b/>
           <w:bCs/>
           <w:color w:val="000000" w:themeColor="text1"/>
           <w:sz w:val="26"/>
           <w:szCs w:val="26"/>
-          <w:lang w:val="fr-FR"/>
         </w:rPr>
         <w:t>N</w:t>
       </w:r>
       <w:r>
         <w:rPr>
-          <w:rFonts w:ascii="Gill Sans MT" w:eastAsia="Gill Sans MT" w:hAnsi="Gill Sans MT" w:cs="Gill Sans MT"/>
-          <w:color w:val="000000" w:themeColor="text1"/>
-          <w:sz w:val="26"/>
-          <w:szCs w:val="26"/>
-          <w:lang w:val="fr-FR"/>
+          <w:rFonts w:ascii="Gill Sans MT" w:hAnsi="Gill Sans MT" w:eastAsia="Gill Sans MT" w:cs="Gill Sans MT"/>
+          <w:color w:val="000000" w:themeColor="text1"/>
+          <w:sz w:val="26"/>
+          <w:szCs w:val="26"/>
         </w:rPr>
         <w:t xml:space="preserve">ous, soussignés </w:t>
       </w:r>
       <w:r>
         <w:rPr>
-          <w:rFonts w:ascii="Gill Sans MT" w:eastAsia="Gill Sans MT" w:hAnsi="Gill Sans MT" w:cs="Gill Sans MT"/>
+          <w:rFonts w:ascii="Gill Sans MT" w:hAnsi="Gill Sans MT" w:eastAsia="Gill Sans MT" w:cs="Gill Sans MT"/>
           <w:b/>
           <w:bCs/>
           <w:color w:val="000000" w:themeColor="text1"/>
           <w:sz w:val="26"/>
           <w:szCs w:val="26"/>
-          <w:lang w:val="fr-FR"/>
         </w:rPr>
         <w:t>O</w:t>
       </w:r>
       <w:r>
         <w:rPr>
-          <w:rFonts w:ascii="Gill Sans MT" w:eastAsia="Gill Sans MT" w:hAnsi="Gill Sans MT" w:cs="Gill Sans MT"/>
-          <w:color w:val="000000" w:themeColor="text1"/>
-          <w:sz w:val="26"/>
-          <w:szCs w:val="26"/>
-          <w:lang w:val="fr-FR"/>
+          <w:rFonts w:ascii="Gill Sans MT" w:hAnsi="Gill Sans MT" w:eastAsia="Gill Sans MT" w:cs="Gill Sans MT"/>
+          <w:color w:val="000000" w:themeColor="text1"/>
+          <w:sz w:val="26"/>
+          <w:szCs w:val="26"/>
         </w:rPr>
         <w:t xml:space="preserve">ffice de la </w:t>
       </w:r>
       <w:r>
         <w:rPr>
-          <w:rFonts w:ascii="Gill Sans MT" w:eastAsia="Gill Sans MT" w:hAnsi="Gill Sans MT" w:cs="Gill Sans MT"/>
+          <w:rFonts w:ascii="Gill Sans MT" w:hAnsi="Gill Sans MT" w:eastAsia="Gill Sans MT" w:cs="Gill Sans MT"/>
           <w:b/>
           <w:bCs/>
           <w:color w:val="000000" w:themeColor="text1"/>
           <w:sz w:val="26"/>
           <w:szCs w:val="26"/>
-          <w:lang w:val="fr-FR"/>
         </w:rPr>
         <w:t>F</w:t>
       </w:r>
       <w:r>
         <w:rPr>
-          <w:rFonts w:ascii="Gill Sans MT" w:eastAsia="Gill Sans MT" w:hAnsi="Gill Sans MT" w:cs="Gill Sans MT"/>
-          <w:color w:val="000000" w:themeColor="text1"/>
-          <w:sz w:val="26"/>
-          <w:szCs w:val="26"/>
-          <w:lang w:val="fr-FR"/>
+          <w:rFonts w:ascii="Gill Sans MT" w:hAnsi="Gill Sans MT" w:eastAsia="Gill Sans MT" w:cs="Gill Sans MT"/>
+          <w:color w:val="000000" w:themeColor="text1"/>
+          <w:sz w:val="26"/>
+          <w:szCs w:val="26"/>
         </w:rPr>
         <w:t xml:space="preserve">ormation </w:t>
       </w:r>
       <w:r>
         <w:rPr>
-          <w:rFonts w:ascii="Gill Sans MT" w:eastAsia="Gill Sans MT" w:hAnsi="Gill Sans MT" w:cs="Gill Sans MT"/>
+          <w:rFonts w:ascii="Gill Sans MT" w:hAnsi="Gill Sans MT" w:eastAsia="Gill Sans MT" w:cs="Gill Sans MT"/>
           <w:b/>
           <w:bCs/>
           <w:color w:val="000000" w:themeColor="text1"/>
           <w:sz w:val="26"/>
           <w:szCs w:val="26"/>
-          <w:lang w:val="fr-FR"/>
         </w:rPr>
         <w:t>P</w:t>
       </w:r>
       <w:r>
         <w:rPr>
-          <w:rFonts w:ascii="Gill Sans MT" w:eastAsia="Gill Sans MT" w:hAnsi="Gill Sans MT" w:cs="Gill Sans MT"/>
-          <w:color w:val="000000" w:themeColor="text1"/>
-          <w:sz w:val="26"/>
-          <w:szCs w:val="26"/>
-          <w:lang w:val="fr-FR"/>
+          <w:rFonts w:ascii="Gill Sans MT" w:hAnsi="Gill Sans MT" w:eastAsia="Gill Sans MT" w:cs="Gill Sans MT"/>
+          <w:color w:val="000000" w:themeColor="text1"/>
+          <w:sz w:val="26"/>
+          <w:szCs w:val="26"/>
         </w:rPr>
         <w:t xml:space="preserve">rofessionnelle et de la </w:t>
       </w:r>
       <w:r>
         <w:rPr>
-          <w:rFonts w:ascii="Gill Sans MT" w:eastAsia="Gill Sans MT" w:hAnsi="Gill Sans MT" w:cs="Gill Sans MT"/>
+          <w:rFonts w:ascii="Gill Sans MT" w:hAnsi="Gill Sans MT" w:eastAsia="Gill Sans MT" w:cs="Gill Sans MT"/>
           <w:b/>
           <w:bCs/>
           <w:color w:val="000000" w:themeColor="text1"/>
           <w:sz w:val="26"/>
           <w:szCs w:val="26"/>
-          <w:lang w:val="fr-FR"/>
         </w:rPr>
         <w:t>P</w:t>
       </w:r>
       <w:r>
         <w:rPr>
-          <w:rFonts w:ascii="Gill Sans MT" w:eastAsia="Gill Sans MT" w:hAnsi="Gill Sans MT" w:cs="Gill Sans MT"/>
-          <w:color w:val="000000" w:themeColor="text1"/>
-          <w:sz w:val="26"/>
-          <w:szCs w:val="26"/>
-          <w:lang w:val="fr-FR"/>
+          <w:rFonts w:ascii="Gill Sans MT" w:hAnsi="Gill Sans MT" w:eastAsia="Gill Sans MT" w:cs="Gill Sans MT"/>
+          <w:color w:val="000000" w:themeColor="text1"/>
+          <w:sz w:val="26"/>
+          <w:szCs w:val="26"/>
         </w:rPr>
         <w:t xml:space="preserve">romotion du </w:t>
       </w:r>
       <w:r>
         <w:rPr>
-          <w:rFonts w:ascii="Gill Sans MT" w:eastAsia="Gill Sans MT" w:hAnsi="Gill Sans MT" w:cs="Gill Sans MT"/>
+          <w:rFonts w:ascii="Gill Sans MT" w:hAnsi="Gill Sans MT" w:eastAsia="Gill Sans MT" w:cs="Gill Sans MT"/>
           <w:b/>
           <w:bCs/>
           <w:color w:val="000000" w:themeColor="text1"/>
           <w:sz w:val="26"/>
           <w:szCs w:val="26"/>
-          <w:lang w:val="fr-FR"/>
         </w:rPr>
         <w:t>T</w:t>
       </w:r>
       <w:r>
         <w:rPr>
-          <w:rFonts w:ascii="Gill Sans MT" w:eastAsia="Gill Sans MT" w:hAnsi="Gill Sans MT" w:cs="Gill Sans MT"/>
-          <w:color w:val="000000" w:themeColor="text1"/>
-          <w:sz w:val="26"/>
-          <w:szCs w:val="26"/>
-          <w:lang w:val="fr-FR"/>
+          <w:rFonts w:ascii="Gill Sans MT" w:hAnsi="Gill Sans MT" w:eastAsia="Gill Sans MT" w:cs="Gill Sans MT"/>
+          <w:color w:val="000000" w:themeColor="text1"/>
+          <w:sz w:val="26"/>
+          <w:szCs w:val="26"/>
         </w:rPr>
         <w:t>ravail, attestons que :</w:t>
       </w:r>
@@ -493,11 +368,10 @@
         <w:spacing w:after="0" w:line="240" w:lineRule="auto"/>
         <w:ind w:left="426"/>
         <w:rPr>
-          <w:rFonts w:ascii="Gill Sans MT" w:eastAsia="Gill Sans MT" w:hAnsi="Gill Sans MT" w:cs="Gill Sans MT"/>
-          <w:color w:val="000000" w:themeColor="text1"/>
-          <w:sz w:val="26"/>
-          <w:szCs w:val="26"/>
-          <w:lang w:val="fr-FR"/>
+          <w:rFonts w:ascii="Gill Sans MT" w:hAnsi="Gill Sans MT" w:eastAsia="Gill Sans MT" w:cs="Gill Sans MT"/>
+          <w:color w:val="000000" w:themeColor="text1"/>
+          <w:sz w:val="26"/>
+          <w:szCs w:val="26"/>
         </w:rPr>
       </w:pPr>
     </w:p>
@@ -509,106 +383,31 @@
         <w:spacing w:after="0" w:line="240" w:lineRule="auto"/>
         <w:ind w:left="426"/>
         <w:rPr>
-          <w:rFonts w:ascii="Gill Sans MT" w:eastAsia="Gill Sans MT" w:hAnsi="Gill Sans MT" w:cs="Gill Sans MT"/>
-          <w:color w:val="000000" w:themeColor="text1"/>
-          <w:sz w:val="26"/>
-          <w:szCs w:val="26"/>
-          <w:lang w:val="fr-FR"/>
-        </w:rPr>
-      </w:pPr>
-      <w:r>
-        <w:rPr>
-          <w:rFonts w:ascii="Gill Sans MT" w:eastAsia="Gill Sans MT" w:hAnsi="Gill Sans MT" w:cs="Gill Sans MT"/>
-          <w:color w:val="000000" w:themeColor="text1"/>
-          <w:sz w:val="26"/>
-          <w:szCs w:val="26"/>
-          <w:lang w:val="fr-FR"/>
-        </w:rPr>
-        <w:t>${</w:t>
-      </w:r>
-      <w:proofErr w:type="spellStart"/>
-      <w:r>
-        <w:rPr>
-          <w:rFonts w:ascii="Gill Sans MT" w:eastAsia="Gill Sans MT" w:hAnsi="Gill Sans MT" w:cs="Gill Sans MT"/>
-          <w:color w:val="000000" w:themeColor="text1"/>
-          <w:sz w:val="26"/>
-          <w:szCs w:val="26"/>
-          <w:lang w:val="fr-FR"/>
-        </w:rPr>
-        <w:t>title</w:t>
-      </w:r>
-      <w:proofErr w:type="spellEnd"/>
-      <w:r>
-        <w:rPr>
-          <w:rFonts w:ascii="Gill Sans MT" w:eastAsia="Gill Sans MT" w:hAnsi="Gill Sans MT" w:cs="Gill Sans MT"/>
-          <w:color w:val="000000" w:themeColor="text1"/>
-          <w:sz w:val="26"/>
-          <w:szCs w:val="26"/>
-          <w:lang w:val="fr-FR"/>
-        </w:rPr>
-        <w:t xml:space="preserve">}                   </w:t>
-      </w:r>
-      <w:r>
-        <w:rPr>
-          <w:rFonts w:ascii="Gill Sans MT" w:eastAsia="Gill Sans MT" w:hAnsi="Gill Sans MT" w:cs="Gill Sans MT"/>
-          <w:color w:val="000000" w:themeColor="text1"/>
-          <w:sz w:val="26"/>
-          <w:szCs w:val="26"/>
-          <w:lang w:val="fr-FR"/>
-        </w:rPr>
-        <w:t xml:space="preserve">  : </w:t>
-      </w:r>
-      <w:r>
-        <w:rPr>
-          <w:rFonts w:ascii="Gill Sans MT" w:eastAsia="Gill Sans MT" w:hAnsi="Gill Sans MT" w:cs="Gill Sans MT"/>
-          <w:color w:val="000000" w:themeColor="text1"/>
-          <w:sz w:val="26"/>
-          <w:szCs w:val="26"/>
-          <w:lang w:val="fr-FR"/>
-        </w:rPr>
-        <w:t>$</w:t>
-      </w:r>
-      <w:r>
-        <w:rPr>
-          <w:rFonts w:ascii="Gill Sans MT" w:eastAsia="Gill Sans MT" w:hAnsi="Gill Sans MT" w:cs="Gill Sans MT"/>
-          <w:color w:val="000000" w:themeColor="text1"/>
-          <w:sz w:val="26"/>
-          <w:szCs w:val="26"/>
-          <w:lang w:val="fr-FR"/>
-        </w:rPr>
-        <w:t>{</w:t>
-      </w:r>
-      <w:proofErr w:type="spellStart"/>
-      <w:r>
-        <w:rPr>
-          <w:rFonts w:ascii="Gill Sans MT" w:eastAsia="Gill Sans MT" w:hAnsi="Gill Sans MT" w:cs="Gill Sans MT"/>
-          <w:color w:val="000000" w:themeColor="text1"/>
-          <w:sz w:val="26"/>
-          <w:szCs w:val="26"/>
-          <w:lang w:val="fr-FR"/>
-        </w:rPr>
-        <w:t>full</w:t>
-      </w:r>
-      <w:r>
-        <w:rPr>
-          <w:rFonts w:ascii="Gill Sans MT" w:eastAsia="Gill Sans MT" w:hAnsi="Gill Sans MT" w:cs="Gill Sans MT"/>
-          <w:color w:val="000000" w:themeColor="text1"/>
-          <w:sz w:val="26"/>
-          <w:szCs w:val="26"/>
-          <w:lang w:val="fr-FR"/>
-        </w:rPr>
-        <w:t>name</w:t>
-      </w:r>
-      <w:proofErr w:type="spellEnd"/>
-      <w:r>
-        <w:rPr>
-          <w:rFonts w:ascii="Gill Sans MT" w:eastAsia="Gill Sans MT" w:hAnsi="Gill Sans MT" w:cs="Gill Sans MT"/>
-          <w:color w:val="000000" w:themeColor="text1"/>
-          <w:sz w:val="26"/>
-          <w:szCs w:val="26"/>
-          <w:lang w:val="fr-FR"/>
-        </w:rPr>
-        <w:t>}</w:t>
+          <w:rFonts w:ascii="Gill Sans MT" w:hAnsi="Gill Sans MT" w:eastAsia="Gill Sans MT" w:cs="Gill Sans MT"/>
+          <w:color w:val="000000" w:themeColor="text1"/>
+          <w:sz w:val="26"/>
+          <w:szCs w:val="26"/>
+        </w:rPr>
+      </w:pPr>
+      <w:r>
+        <w:rPr>
+          <w:rFonts w:ascii="Gill Sans MT" w:hAnsi="Gill Sans MT" w:eastAsia="Gill Sans MT" w:cs="Gill Sans MT"/>
+          <w:b/>
+          <w:bCs/>
+          <w:color w:val="000000" w:themeColor="text1"/>
+          <w:sz w:val="26"/>
+          <w:szCs w:val="26"/>
+        </w:rPr>
+        <w:t>${title}</w:t>
+      </w:r>
+      <w:r>
+        <w:rPr>
+          <w:rFonts w:ascii="Gill Sans MT" w:hAnsi="Gill Sans MT" w:eastAsia="Gill Sans MT" w:cs="Gill Sans MT"/>
+          <w:color w:val="000000" w:themeColor="text1"/>
+          <w:sz w:val="26"/>
+          <w:szCs w:val="26"/>
+        </w:rPr>
+        <w:t xml:space="preserve">                     : ${fullname}</w:t>
       </w:r>
     </w:p>
     <w:p>
@@ -619,78 +418,43 @@
         <w:spacing w:after="0" w:line="240" w:lineRule="auto"/>
         <w:ind w:left="426"/>
         <w:rPr>
-          <w:rFonts w:ascii="Gill Sans MT" w:eastAsia="Gill Sans MT" w:hAnsi="Gill Sans MT" w:cs="Gill Sans MT"/>
-          <w:color w:val="000000" w:themeColor="text1"/>
-          <w:sz w:val="26"/>
-          <w:szCs w:val="26"/>
-          <w:lang w:val="fr-FR"/>
-        </w:rPr>
-      </w:pPr>
-      <w:r>
-        <w:rPr>
-          <w:rFonts w:ascii="Gill Sans MT" w:eastAsia="Gill Sans MT" w:hAnsi="Gill Sans MT" w:cs="Gill Sans MT"/>
-          <w:color w:val="000000" w:themeColor="text1"/>
-          <w:sz w:val="26"/>
-          <w:szCs w:val="26"/>
-          <w:lang w:val="fr-FR"/>
-        </w:rPr>
-        <w:t>Matricule </w:t>
-      </w:r>
-      <w:r>
-        <w:rPr>
-          <w:lang w:val="fr-FR"/>
-        </w:rPr>
+          <w:rFonts w:ascii="Gill Sans MT" w:hAnsi="Gill Sans MT" w:eastAsia="Gill Sans MT" w:cs="Gill Sans MT"/>
+          <w:color w:val="000000" w:themeColor="text1"/>
+          <w:sz w:val="26"/>
+          <w:szCs w:val="26"/>
+        </w:rPr>
+      </w:pPr>
+      <w:r>
+        <w:rPr>
+          <w:rFonts w:ascii="Gill Sans MT" w:hAnsi="Gill Sans MT" w:eastAsia="Gill Sans MT" w:cs="Gill Sans MT"/>
+          <w:b/>
+          <w:bCs/>
+          <w:color w:val="000000" w:themeColor="text1"/>
+          <w:sz w:val="26"/>
+          <w:szCs w:val="26"/>
+        </w:rPr>
+        <w:t>Matricule</w:t>
+      </w:r>
+      <w:r>
+        <w:rPr>
+          <w:rFonts w:ascii="Gill Sans MT" w:hAnsi="Gill Sans MT" w:eastAsia="Gill Sans MT" w:cs="Gill Sans MT"/>
+          <w:color w:val="000000" w:themeColor="text1"/>
+          <w:sz w:val="26"/>
+          <w:szCs w:val="26"/>
+        </w:rPr>
+        <w:t> </w:t>
+      </w:r>
+      <w:r>
         <w:tab/>
       </w:r>
       <w:r>
         <w:rPr>
-          <w:rFonts w:ascii="Gill Sans MT" w:eastAsia="Gill Sans MT" w:hAnsi="Gill Sans MT" w:cs="Gill Sans MT"/>
-          <w:color w:val="000000" w:themeColor="text1"/>
-          <w:sz w:val="26"/>
-          <w:szCs w:val="26"/>
-          <w:lang w:val="fr-FR"/>
-        </w:rPr>
-        <w:t xml:space="preserve">   : </w:t>
-      </w:r>
-      <w:r>
-        <w:rPr>
-          <w:rFonts w:ascii="Gill Sans MT" w:eastAsia="Gill Sans MT" w:hAnsi="Gill Sans MT" w:cs="Gill Sans MT"/>
-          <w:color w:val="000000" w:themeColor="text1"/>
-          <w:sz w:val="26"/>
-          <w:szCs w:val="26"/>
-          <w:lang w:val="fr-FR"/>
-        </w:rPr>
-        <w:t>$</w:t>
-      </w:r>
-      <w:r>
-        <w:rPr>
-          <w:rFonts w:ascii="Gill Sans MT" w:eastAsia="Gill Sans MT" w:hAnsi="Gill Sans MT" w:cs="Gill Sans MT"/>
-          <w:color w:val="000000" w:themeColor="text1"/>
-          <w:sz w:val="26"/>
-          <w:szCs w:val="26"/>
-          <w:lang w:val="fr-FR"/>
-        </w:rPr>
-        <w:t>{</w:t>
-      </w:r>
-      <w:r>
-        <w:rPr>
-          <w:rFonts w:ascii="Gill Sans MT" w:eastAsia="Gill Sans MT" w:hAnsi="Gill Sans MT" w:cs="Gill Sans MT"/>
-          <w:color w:val="000000" w:themeColor="text1"/>
-          <w:sz w:val="26"/>
-          <w:szCs w:val="26"/>
-          <w:lang w:val="fr-FR"/>
-        </w:rPr>
-        <w:t>matricule</w:t>
-      </w:r>
-      <w:r>
-        <w:rPr>
-          <w:rFonts w:ascii="Gill Sans MT" w:eastAsia="Gill Sans MT" w:hAnsi="Gill Sans MT" w:cs="Gill Sans MT"/>
-          <w:color w:val="000000" w:themeColor="text1"/>
-          <w:sz w:val="26"/>
-          <w:szCs w:val="26"/>
-          <w:lang w:val="fr-FR"/>
-        </w:rPr>
-        <w:t>}</w:t>
+          <w:rFonts w:ascii="Gill Sans MT" w:hAnsi="Gill Sans MT" w:eastAsia="Gill Sans MT" w:cs="Gill Sans MT"/>
+          <w:color w:val="000000" w:themeColor="text1"/>
+          <w:sz w:val="26"/>
+          <w:szCs w:val="26"/>
+        </w:rPr>
+        <w:t xml:space="preserve">   : ${matricule}</w:t>
       </w:r>
     </w:p>
     <w:p>
@@ -701,33 +465,30 @@
         <w:spacing w:after="0" w:line="240" w:lineRule="auto"/>
         <w:ind w:left="426"/>
         <w:rPr>
-          <w:rFonts w:ascii="Gill Sans MT" w:eastAsia="Gill Sans MT" w:hAnsi="Gill Sans MT" w:cs="Gill Sans MT"/>
-          <w:color w:val="000000" w:themeColor="text1"/>
-          <w:sz w:val="26"/>
-          <w:szCs w:val="26"/>
-          <w:lang w:val="fr-FR"/>
-        </w:rPr>
-      </w:pPr>
-    </w:p>
-    <w:p>
-      <w:pPr>
-        <w:spacing w:after="0" w:line="240" w:lineRule="auto"/>
-        <w:ind w:left="426"/>
-        <w:rPr>
-          <w:rFonts w:ascii="Gill Sans MT" w:eastAsia="Gill Sans MT" w:hAnsi="Gill Sans MT" w:cs="Gill Sans MT"/>
-          <w:color w:val="000000" w:themeColor="text1"/>
-          <w:sz w:val="26"/>
-          <w:szCs w:val="26"/>
-          <w:lang w:val="fr-FR"/>
-        </w:rPr>
-      </w:pPr>
-      <w:r>
-        <w:rPr>
-          <w:rFonts w:ascii="Gill Sans MT" w:eastAsia="Gill Sans MT" w:hAnsi="Gill Sans MT" w:cs="Gill Sans MT"/>
-          <w:color w:val="000000" w:themeColor="text1"/>
-          <w:sz w:val="26"/>
-          <w:szCs w:val="26"/>
-          <w:lang w:val="fr-FR"/>
+          <w:rFonts w:ascii="Gill Sans MT" w:hAnsi="Gill Sans MT" w:eastAsia="Gill Sans MT" w:cs="Gill Sans MT"/>
+          <w:color w:val="000000" w:themeColor="text1"/>
+          <w:sz w:val="26"/>
+          <w:szCs w:val="26"/>
+        </w:rPr>
+      </w:pPr>
+    </w:p>
+    <w:p>
+      <w:pPr>
+        <w:spacing w:after="0" w:line="240" w:lineRule="auto"/>
+        <w:ind w:left="426"/>
+        <w:rPr>
+          <w:rFonts w:ascii="Gill Sans MT" w:hAnsi="Gill Sans MT" w:eastAsia="Gill Sans MT" w:cs="Gill Sans MT"/>
+          <w:color w:val="000000" w:themeColor="text1"/>
+          <w:sz w:val="26"/>
+          <w:szCs w:val="26"/>
+        </w:rPr>
+      </w:pPr>
+      <w:r>
+        <w:rPr>
+          <w:rFonts w:ascii="Gill Sans MT" w:hAnsi="Gill Sans MT" w:eastAsia="Gill Sans MT" w:cs="Gill Sans MT"/>
+          <w:color w:val="000000" w:themeColor="text1"/>
+          <w:sz w:val="26"/>
+          <w:szCs w:val="26"/>
         </w:rPr>
         <w:t xml:space="preserve">Est employée au sein de nos services en qualité de : </w:t>
       </w:r>
@@ -737,155 +498,140 @@
         <w:spacing w:after="0" w:line="240" w:lineRule="auto"/>
         <w:ind w:left="426"/>
         <w:rPr>
-          <w:rFonts w:ascii="Gill Sans MT" w:eastAsia="Gill Sans MT" w:hAnsi="Gill Sans MT" w:cs="Gill Sans MT"/>
-          <w:color w:val="000000" w:themeColor="text1"/>
-          <w:sz w:val="26"/>
-          <w:szCs w:val="26"/>
-          <w:lang w:val="fr-FR"/>
-        </w:rPr>
-      </w:pPr>
-    </w:p>
-    <w:p>
-      <w:pPr>
-        <w:spacing w:after="0" w:line="240" w:lineRule="auto"/>
-        <w:ind w:left="426"/>
-        <w:rPr>
-          <w:rFonts w:ascii="Gill Sans MT" w:eastAsia="Gill Sans MT" w:hAnsi="Gill Sans MT" w:cs="Gill Sans MT"/>
-          <w:color w:val="000000" w:themeColor="text1"/>
-          <w:sz w:val="26"/>
-          <w:szCs w:val="26"/>
-          <w:lang w:val="fr-FR"/>
-        </w:rPr>
-      </w:pPr>
-      <w:r>
-        <w:rPr>
-          <w:rFonts w:ascii="Gill Sans MT" w:eastAsia="Gill Sans MT" w:hAnsi="Gill Sans MT" w:cs="Gill Sans MT"/>
-          <w:color w:val="000000" w:themeColor="text1"/>
-          <w:sz w:val="26"/>
-          <w:szCs w:val="26"/>
-          <w:lang w:val="fr-FR"/>
-        </w:rPr>
-        <w:t xml:space="preserve">Grade </w:t>
-      </w:r>
-      <w:r>
-        <w:rPr>
-          <w:lang w:val="fr-FR"/>
-        </w:rPr>
+          <w:rFonts w:ascii="Gill Sans MT" w:hAnsi="Gill Sans MT" w:eastAsia="Gill Sans MT" w:cs="Gill Sans MT"/>
+          <w:color w:val="000000" w:themeColor="text1"/>
+          <w:sz w:val="26"/>
+          <w:szCs w:val="26"/>
+        </w:rPr>
+      </w:pPr>
+    </w:p>
+    <w:p>
+      <w:pPr>
+        <w:spacing w:after="0" w:line="240" w:lineRule="auto"/>
+        <w:ind w:left="426"/>
+        <w:rPr>
+          <w:rFonts w:ascii="Gill Sans MT" w:hAnsi="Gill Sans MT" w:eastAsia="Gill Sans MT" w:cs="Gill Sans MT"/>
+          <w:color w:val="000000" w:themeColor="text1"/>
+          <w:sz w:val="26"/>
+          <w:szCs w:val="26"/>
+        </w:rPr>
+      </w:pPr>
+      <w:r>
+        <w:rPr>
+          <w:rFonts w:ascii="Gill Sans MT" w:hAnsi="Gill Sans MT" w:eastAsia="Gill Sans MT" w:cs="Gill Sans MT"/>
+          <w:b/>
+          <w:bCs/>
+          <w:color w:val="000000" w:themeColor="text1"/>
+          <w:sz w:val="26"/>
+          <w:szCs w:val="26"/>
+        </w:rPr>
+        <w:t>Grade</w:t>
+      </w:r>
+      <w:r>
+        <w:rPr>
+          <w:rFonts w:ascii="Gill Sans MT" w:hAnsi="Gill Sans MT" w:eastAsia="Gill Sans MT" w:cs="Gill Sans MT"/>
+          <w:color w:val="000000" w:themeColor="text1"/>
+          <w:sz w:val="26"/>
+          <w:szCs w:val="26"/>
+        </w:rPr>
+        <w:t xml:space="preserve"> </w:t>
+      </w:r>
+      <w:r>
         <w:tab/>
       </w:r>
       <w:r>
         <w:rPr>
-          <w:rFonts w:ascii="Gill Sans MT" w:eastAsia="Gill Sans MT" w:hAnsi="Gill Sans MT" w:cs="Gill Sans MT"/>
-          <w:color w:val="000000" w:themeColor="text1"/>
-          <w:sz w:val="26"/>
-          <w:szCs w:val="26"/>
-          <w:lang w:val="fr-FR"/>
+          <w:rFonts w:ascii="Gill Sans MT" w:hAnsi="Gill Sans MT" w:eastAsia="Gill Sans MT" w:cs="Gill Sans MT"/>
+          <w:color w:val="000000" w:themeColor="text1"/>
+          <w:sz w:val="26"/>
+          <w:szCs w:val="26"/>
+        </w:rPr>
+        <w:t>: ${grade}</w:t>
+      </w:r>
+    </w:p>
+    <w:p>
+      <w:pPr>
+        <w:spacing w:after="0" w:line="240" w:lineRule="auto"/>
+        <w:ind w:left="426"/>
+        <w:rPr>
+          <w:rFonts w:ascii="Gill Sans MT" w:hAnsi="Gill Sans MT" w:eastAsia="Gill Sans MT" w:cs="Gill Sans MT"/>
+          <w:color w:val="000000" w:themeColor="text1"/>
+          <w:sz w:val="26"/>
+          <w:szCs w:val="26"/>
+        </w:rPr>
+      </w:pPr>
+      <w:r>
+        <w:rPr>
+          <w:rFonts w:ascii="Gill Sans MT" w:hAnsi="Gill Sans MT" w:eastAsia="Gill Sans MT" w:cs="Gill Sans MT"/>
+          <w:b/>
+          <w:bCs/>
+          <w:color w:val="000000" w:themeColor="text1"/>
+          <w:sz w:val="26"/>
+          <w:szCs w:val="26"/>
+        </w:rPr>
+        <w:t>Lieu</w:t>
+      </w:r>
+      <w:r>
+        <w:tab/>
+      </w:r>
+      <w:r>
+        <w:rPr>
+          <w:rFonts w:ascii="Gill Sans MT" w:hAnsi="Gill Sans MT" w:eastAsia="Gill Sans MT" w:cs="Gill Sans MT"/>
+          <w:color w:val="000000" w:themeColor="text1"/>
+          <w:sz w:val="26"/>
+          <w:szCs w:val="26"/>
+        </w:rPr>
+        <w:t>: CMC Béni Mellal-khénifra</w:t>
+      </w:r>
+    </w:p>
+    <w:p>
+      <w:pPr>
+        <w:spacing w:after="0" w:line="240" w:lineRule="auto"/>
+        <w:ind w:left="426"/>
+        <w:rPr>
+          <w:rFonts w:ascii="Gill Sans MT" w:hAnsi="Gill Sans MT" w:eastAsia="Gill Sans MT" w:cs="Gill Sans MT"/>
+          <w:color w:val="000000" w:themeColor="text1"/>
+          <w:sz w:val="26"/>
+          <w:szCs w:val="26"/>
+        </w:rPr>
+      </w:pPr>
+      <w:r>
+        <w:rPr>
+          <w:rFonts w:ascii="Gill Sans MT" w:hAnsi="Gill Sans MT" w:eastAsia="Gill Sans MT" w:cs="Gill Sans MT"/>
+          <w:b/>
+          <w:bCs/>
+          <w:color w:val="000000" w:themeColor="text1"/>
+          <w:sz w:val="26"/>
+          <w:szCs w:val="26"/>
+        </w:rPr>
+        <w:t>Fonction</w:t>
+      </w:r>
+      <w:r>
+        <w:rPr>
+          <w:rFonts w:ascii="Gill Sans MT" w:hAnsi="Gill Sans MT" w:eastAsia="Gill Sans MT" w:cs="Gill Sans MT"/>
+          <w:color w:val="000000" w:themeColor="text1"/>
+          <w:sz w:val="26"/>
+          <w:szCs w:val="26"/>
+        </w:rPr>
+        <w:t xml:space="preserve"> </w:t>
+      </w:r>
+      <w:r>
+        <w:tab/>
+      </w:r>
+      <w:r>
+        <w:rPr>
+          <w:rFonts w:ascii="Gill Sans MT" w:hAnsi="Gill Sans MT" w:eastAsia="Gill Sans MT" w:cs="Gill Sans MT"/>
+          <w:color w:val="000000" w:themeColor="text1"/>
+          <w:sz w:val="26"/>
+          <w:szCs w:val="26"/>
         </w:rPr>
         <w:t xml:space="preserve">: </w:t>
       </w:r>
       <w:r>
         <w:rPr>
-          <w:rFonts w:ascii="Gill Sans MT" w:eastAsia="Gill Sans MT" w:hAnsi="Gill Sans MT" w:cs="Gill Sans MT"/>
-          <w:color w:val="000000" w:themeColor="text1"/>
-          <w:sz w:val="26"/>
-          <w:szCs w:val="26"/>
-          <w:lang w:val="fr-FR"/>
-        </w:rPr>
-        <w:t>${grade}</w:t>
-      </w:r>
-    </w:p>
-    <w:p>
-      <w:pPr>
-        <w:spacing w:after="0" w:line="240" w:lineRule="auto"/>
-        <w:ind w:left="426"/>
-        <w:rPr>
-          <w:rFonts w:ascii="Gill Sans MT" w:eastAsia="Gill Sans MT" w:hAnsi="Gill Sans MT" w:cs="Gill Sans MT"/>
-          <w:color w:val="000000" w:themeColor="text1"/>
-          <w:sz w:val="26"/>
-          <w:szCs w:val="26"/>
-          <w:lang w:val="fr-FR"/>
-        </w:rPr>
-      </w:pPr>
-      <w:r>
-        <w:rPr>
-          <w:rFonts w:ascii="Gill Sans MT" w:eastAsia="Gill Sans MT" w:hAnsi="Gill Sans MT" w:cs="Gill Sans MT"/>
-          <w:color w:val="000000" w:themeColor="text1"/>
-          <w:sz w:val="26"/>
-          <w:szCs w:val="26"/>
-          <w:lang w:val="fr-FR"/>
-        </w:rPr>
-        <w:t>Lieu</w:t>
-      </w:r>
-      <w:r>
-        <w:rPr>
-          <w:lang w:val="fr-FR"/>
-        </w:rPr>
-        <w:tab/>
-      </w:r>
-      <w:r>
-        <w:rPr>
-          <w:rFonts w:ascii="Gill Sans MT" w:eastAsia="Gill Sans MT" w:hAnsi="Gill Sans MT" w:cs="Gill Sans MT"/>
-          <w:color w:val="000000" w:themeColor="text1"/>
-          <w:sz w:val="26"/>
-          <w:szCs w:val="26"/>
-          <w:lang w:val="fr-FR"/>
-        </w:rPr>
-        <w:t>: CMC Béni Mellal-</w:t>
-      </w:r>
-      <w:proofErr w:type="spellStart"/>
-      <w:r>
-        <w:rPr>
-          <w:rFonts w:ascii="Gill Sans MT" w:eastAsia="Gill Sans MT" w:hAnsi="Gill Sans MT" w:cs="Gill Sans MT"/>
-          <w:color w:val="000000" w:themeColor="text1"/>
-          <w:sz w:val="26"/>
-          <w:szCs w:val="26"/>
-          <w:lang w:val="fr-FR"/>
-        </w:rPr>
-        <w:t>khénifra</w:t>
-      </w:r>
-      <w:proofErr w:type="spellEnd"/>
-    </w:p>
-    <w:p>
-      <w:pPr>
-        <w:spacing w:after="0" w:line="240" w:lineRule="auto"/>
-        <w:ind w:left="426"/>
-        <w:rPr>
-          <w:rFonts w:ascii="Gill Sans MT" w:eastAsia="Gill Sans MT" w:hAnsi="Gill Sans MT" w:cs="Gill Sans MT"/>
-          <w:color w:val="000000" w:themeColor="text1"/>
-          <w:sz w:val="26"/>
-          <w:szCs w:val="26"/>
-          <w:lang w:val="fr-FR"/>
-        </w:rPr>
-      </w:pPr>
-      <w:r>
-        <w:rPr>
-          <w:rFonts w:ascii="Gill Sans MT" w:eastAsia="Gill Sans MT" w:hAnsi="Gill Sans MT" w:cs="Gill Sans MT"/>
-          <w:color w:val="000000" w:themeColor="text1"/>
-          <w:sz w:val="26"/>
-          <w:szCs w:val="26"/>
-          <w:lang w:val="fr-FR"/>
-        </w:rPr>
-        <w:t xml:space="preserve">Fonction </w:t>
-      </w:r>
-      <w:r>
-        <w:rPr>
-          <w:lang w:val="fr-FR"/>
-        </w:rPr>
-        <w:tab/>
-      </w:r>
-      <w:r>
-        <w:rPr>
-          <w:rFonts w:ascii="Gill Sans MT" w:eastAsia="Gill Sans MT" w:hAnsi="Gill Sans MT" w:cs="Gill Sans MT"/>
-          <w:color w:val="000000" w:themeColor="text1"/>
-          <w:sz w:val="26"/>
-          <w:szCs w:val="26"/>
-          <w:lang w:val="fr-FR"/>
-        </w:rPr>
-        <w:t xml:space="preserve">: </w:t>
-      </w:r>
-      <w:r>
-        <w:rPr>
-          <w:lang w:val="fr-FR"/>
+          <w:rFonts w:ascii="Aptos" w:hAnsi="Aptos" w:cs="Arial" w:asciiTheme="minorHAnsi" w:hAnsiTheme="minorHAnsi" w:eastAsiaTheme="minorEastAsia"/>
+          <w:sz w:val="24"/>
+          <w:szCs w:val="24"/>
         </w:rPr>
         <w:t>${position}</w:t>
       </w:r>
@@ -895,54 +641,50 @@
         <w:spacing w:after="0" w:line="240" w:lineRule="auto"/>
         <w:ind w:left="426"/>
         <w:rPr>
-          <w:rFonts w:ascii="Gill Sans MT" w:eastAsia="Gill Sans MT" w:hAnsi="Gill Sans MT" w:cs="Gill Sans MT"/>
-          <w:color w:val="000000" w:themeColor="text1"/>
-          <w:sz w:val="26"/>
-          <w:szCs w:val="26"/>
-          <w:lang w:val="fr-FR"/>
-        </w:rPr>
-      </w:pPr>
-      <w:r>
-        <w:rPr>
-          <w:rFonts w:ascii="Gill Sans MT" w:eastAsia="Gill Sans MT" w:hAnsi="Gill Sans MT" w:cs="Gill Sans MT"/>
-          <w:color w:val="000000" w:themeColor="text1"/>
-          <w:sz w:val="26"/>
-          <w:szCs w:val="26"/>
-          <w:lang w:val="fr-FR"/>
-        </w:rPr>
-        <w:t xml:space="preserve">La Date de Recrutement : </w:t>
-      </w:r>
-      <w:r>
-        <w:rPr>
-          <w:lang w:val="fr-FR"/>
-        </w:rPr>
-        <w:t>${</w:t>
-      </w:r>
-      <w:proofErr w:type="spellStart"/>
-      <w:r>
-        <w:rPr>
-          <w:lang w:val="fr-FR"/>
-        </w:rPr>
-        <w:t>recruitment_date</w:t>
-      </w:r>
-      <w:proofErr w:type="spellEnd"/>
-      <w:r>
-        <w:rPr>
-          <w:lang w:val="fr-FR"/>
-        </w:rPr>
-        <w:t>}</w:t>
-      </w:r>
-    </w:p>
-    <w:p>
-      <w:pPr>
-        <w:spacing w:after="0" w:line="240" w:lineRule="auto"/>
-        <w:ind w:left="426"/>
-        <w:rPr>
-          <w:rFonts w:ascii="Gill Sans MT" w:eastAsia="Gill Sans MT" w:hAnsi="Gill Sans MT" w:cs="Gill Sans MT"/>
-          <w:color w:val="000000" w:themeColor="text1"/>
-          <w:sz w:val="26"/>
-          <w:szCs w:val="26"/>
-          <w:lang w:val="fr-FR"/>
+          <w:rFonts w:ascii="Gill Sans MT" w:hAnsi="Gill Sans MT" w:eastAsia="Gill Sans MT" w:cs="Gill Sans MT"/>
+          <w:color w:val="000000" w:themeColor="text1"/>
+          <w:sz w:val="26"/>
+          <w:szCs w:val="26"/>
+        </w:rPr>
+      </w:pPr>
+      <w:r>
+        <w:rPr>
+          <w:rFonts w:ascii="Gill Sans MT" w:hAnsi="Gill Sans MT" w:eastAsia="Gill Sans MT" w:cs="Gill Sans MT"/>
+          <w:b/>
+          <w:bCs/>
+          <w:color w:val="000000" w:themeColor="text1"/>
+          <w:sz w:val="26"/>
+          <w:szCs w:val="26"/>
+        </w:rPr>
+        <w:t>La Date de Recrutement</w:t>
+      </w:r>
+      <w:r>
+        <w:rPr>
+          <w:rFonts w:ascii="Gill Sans MT" w:hAnsi="Gill Sans MT" w:eastAsia="Gill Sans MT" w:cs="Gill Sans MT"/>
+          <w:color w:val="000000" w:themeColor="text1"/>
+          <w:sz w:val="26"/>
+          <w:szCs w:val="26"/>
+        </w:rPr>
+        <w:t xml:space="preserve"> : </w:t>
+      </w:r>
+      <w:r>
+        <w:rPr>
+          <w:rFonts w:ascii="Aptos" w:hAnsi="Aptos" w:cs="Arial" w:asciiTheme="minorHAnsi" w:hAnsiTheme="minorHAnsi" w:eastAsiaTheme="minorEastAsia"/>
+          <w:sz w:val="24"/>
+          <w:szCs w:val="24"/>
+        </w:rPr>
+        <w:t>${recruitment_date}</w:t>
+      </w:r>
+    </w:p>
+    <w:p>
+      <w:pPr>
+        <w:spacing w:after="0" w:line="240" w:lineRule="auto"/>
+        <w:ind w:left="426"/>
+        <w:rPr>
+          <w:rFonts w:ascii="Gill Sans MT" w:hAnsi="Gill Sans MT" w:eastAsia="Gill Sans MT" w:cs="Gill Sans MT"/>
+          <w:color w:val="000000" w:themeColor="text1"/>
+          <w:sz w:val="26"/>
+          <w:szCs w:val="26"/>
         </w:rPr>
       </w:pPr>
     </w:p>
@@ -954,20 +696,18 @@
         <w:spacing w:after="0" w:line="240" w:lineRule="auto"/>
         <w:ind w:left="426"/>
         <w:rPr>
-          <w:rFonts w:ascii="Gill Sans MT" w:eastAsia="Gill Sans MT" w:hAnsi="Gill Sans MT" w:cs="Gill Sans MT"/>
-          <w:color w:val="000000" w:themeColor="text1"/>
-          <w:sz w:val="26"/>
-          <w:szCs w:val="26"/>
-          <w:lang w:val="fr-FR"/>
-        </w:rPr>
-      </w:pPr>
-      <w:r>
-        <w:rPr>
-          <w:rFonts w:ascii="Gill Sans MT" w:eastAsia="Gill Sans MT" w:hAnsi="Gill Sans MT" w:cs="Gill Sans MT"/>
-          <w:color w:val="000000" w:themeColor="text1"/>
-          <w:sz w:val="26"/>
-          <w:szCs w:val="26"/>
-          <w:lang w:val="fr-FR"/>
+          <w:rFonts w:ascii="Gill Sans MT" w:hAnsi="Gill Sans MT" w:eastAsia="Gill Sans MT" w:cs="Gill Sans MT"/>
+          <w:color w:val="000000" w:themeColor="text1"/>
+          <w:sz w:val="26"/>
+          <w:szCs w:val="26"/>
+        </w:rPr>
+      </w:pPr>
+      <w:r>
+        <w:rPr>
+          <w:rFonts w:ascii="Gill Sans MT" w:hAnsi="Gill Sans MT" w:eastAsia="Gill Sans MT" w:cs="Gill Sans MT"/>
+          <w:color w:val="000000" w:themeColor="text1"/>
+          <w:sz w:val="26"/>
+          <w:szCs w:val="26"/>
         </w:rPr>
         <w:t>La présente attestation est délivrée à l’intéressée pour servir et valoir ce que de droit./.</w:t>
       </w:r>
@@ -977,24 +717,22 @@
         <w:spacing w:after="0" w:line="240" w:lineRule="auto"/>
         <w:ind w:left="426"/>
         <w:rPr>
-          <w:rFonts w:ascii="Gill Sans MT" w:eastAsia="Gill Sans MT" w:hAnsi="Gill Sans MT" w:cs="Gill Sans MT"/>
-          <w:color w:val="000000" w:themeColor="text1"/>
-          <w:sz w:val="26"/>
-          <w:szCs w:val="26"/>
-          <w:lang w:val="fr-FR"/>
-        </w:rPr>
-      </w:pPr>
-    </w:p>
-    <w:p>
-      <w:pPr>
-        <w:spacing w:after="0" w:line="240" w:lineRule="auto"/>
-        <w:ind w:left="426"/>
-        <w:rPr>
-          <w:rFonts w:ascii="Gill Sans MT" w:eastAsia="Gill Sans MT" w:hAnsi="Gill Sans MT" w:cs="Gill Sans MT"/>
-          <w:color w:val="000000" w:themeColor="text1"/>
-          <w:sz w:val="26"/>
-          <w:szCs w:val="26"/>
-          <w:lang w:val="fr-FR"/>
+          <w:rFonts w:ascii="Gill Sans MT" w:hAnsi="Gill Sans MT" w:eastAsia="Gill Sans MT" w:cs="Gill Sans MT"/>
+          <w:color w:val="000000" w:themeColor="text1"/>
+          <w:sz w:val="26"/>
+          <w:szCs w:val="26"/>
+        </w:rPr>
+      </w:pPr>
+    </w:p>
+    <w:p>
+      <w:pPr>
+        <w:spacing w:after="0" w:line="240" w:lineRule="auto"/>
+        <w:ind w:left="426"/>
+        <w:rPr>
+          <w:rFonts w:ascii="Gill Sans MT" w:hAnsi="Gill Sans MT" w:eastAsia="Gill Sans MT" w:cs="Gill Sans MT"/>
+          <w:color w:val="000000" w:themeColor="text1"/>
+          <w:sz w:val="26"/>
+          <w:szCs w:val="26"/>
         </w:rPr>
       </w:pPr>
     </w:p>
@@ -1002,11 +740,10 @@
       <w:pPr>
         <w:spacing w:after="200" w:line="276" w:lineRule="auto"/>
         <w:rPr>
-          <w:rFonts w:ascii="Calibri" w:eastAsia="Calibri" w:hAnsi="Calibri" w:cs="Calibri"/>
+          <w:rFonts w:ascii="Calibri" w:hAnsi="Calibri" w:eastAsia="Calibri" w:cs="Calibri"/>
           <w:color w:val="000000" w:themeColor="text1"/>
           <w:sz w:val="22"/>
           <w:szCs w:val="22"/>
-          <w:lang w:val="fr-FR"/>
         </w:rPr>
       </w:pPr>
     </w:p>
@@ -1014,11 +751,10 @@
       <w:pPr>
         <w:spacing w:after="200" w:line="276" w:lineRule="auto"/>
         <w:rPr>
-          <w:rFonts w:ascii="Calibri" w:eastAsia="Calibri" w:hAnsi="Calibri" w:cs="Calibri"/>
+          <w:rFonts w:ascii="Calibri" w:hAnsi="Calibri" w:eastAsia="Calibri" w:cs="Calibri"/>
           <w:color w:val="000000" w:themeColor="text1"/>
           <w:sz w:val="22"/>
           <w:szCs w:val="22"/>
-          <w:lang w:val="fr-FR"/>
         </w:rPr>
       </w:pPr>
     </w:p>
@@ -1027,22 +763,20 @@
         <w:spacing w:after="0" w:line="276" w:lineRule="auto"/>
         <w:ind w:left="5664" w:firstLine="708"/>
         <w:rPr>
-          <w:rFonts w:ascii="Gill Sans MT" w:eastAsia="Gill Sans MT" w:hAnsi="Gill Sans MT" w:cs="Gill Sans MT"/>
+          <w:rFonts w:ascii="Gill Sans MT" w:hAnsi="Gill Sans MT" w:eastAsia="Gill Sans MT" w:cs="Gill Sans MT"/>
           <w:color w:val="000000" w:themeColor="text1"/>
           <w:sz w:val="28"/>
           <w:szCs w:val="28"/>
-          <w:lang w:val="fr-FR"/>
-        </w:rPr>
-      </w:pPr>
-      <w:r>
-        <w:rPr>
-          <w:rFonts w:ascii="Gill Sans MT" w:eastAsia="Gill Sans MT" w:hAnsi="Gill Sans MT" w:cs="Gill Sans MT"/>
+        </w:rPr>
+      </w:pPr>
+      <w:r>
+        <w:rPr>
+          <w:rFonts w:ascii="Gill Sans MT" w:hAnsi="Gill Sans MT" w:eastAsia="Gill Sans MT" w:cs="Gill Sans MT"/>
           <w:i/>
           <w:iCs/>
           <w:color w:val="000000" w:themeColor="text1"/>
           <w:sz w:val="28"/>
           <w:szCs w:val="28"/>
-          <w:lang w:val="fr-FR"/>
         </w:rPr>
         <w:t>Directeur Régional PI</w:t>
       </w:r>
@@ -1052,22 +786,20 @@
         <w:spacing w:after="0" w:line="276" w:lineRule="auto"/>
         <w:ind w:left="5664"/>
         <w:rPr>
-          <w:rFonts w:ascii="Gill Sans MT" w:eastAsia="Gill Sans MT" w:hAnsi="Gill Sans MT" w:cs="Gill Sans MT"/>
+          <w:rFonts w:ascii="Gill Sans MT" w:hAnsi="Gill Sans MT" w:eastAsia="Gill Sans MT" w:cs="Gill Sans MT"/>
           <w:color w:val="000000" w:themeColor="text1"/>
           <w:sz w:val="28"/>
           <w:szCs w:val="28"/>
-          <w:lang w:val="fr-FR"/>
-        </w:rPr>
-      </w:pPr>
-      <w:r>
-        <w:rPr>
-          <w:rFonts w:ascii="Gill Sans MT" w:eastAsia="Gill Sans MT" w:hAnsi="Gill Sans MT" w:cs="Gill Sans MT"/>
+        </w:rPr>
+      </w:pPr>
+      <w:r>
+        <w:rPr>
+          <w:rFonts w:ascii="Gill Sans MT" w:hAnsi="Gill Sans MT" w:eastAsia="Gill Sans MT" w:cs="Gill Sans MT"/>
           <w:i/>
           <w:iCs/>
           <w:color w:val="000000" w:themeColor="text1"/>
           <w:sz w:val="28"/>
           <w:szCs w:val="28"/>
-          <w:lang w:val="fr-FR"/>
         </w:rPr>
         <w:t xml:space="preserve">        EL ABBASSI Marouane</w:t>
       </w:r>
@@ -1078,22 +810,20 @@
         <w:ind w:left="4674"/>
         <w:jc w:val="center"/>
         <w:rPr>
-          <w:rFonts w:ascii="Gill Sans MT" w:eastAsia="Gill Sans MT" w:hAnsi="Gill Sans MT" w:cs="Gill Sans MT"/>
+          <w:rFonts w:ascii="Gill Sans MT" w:hAnsi="Gill Sans MT" w:eastAsia="Gill Sans MT" w:cs="Gill Sans MT"/>
           <w:color w:val="000000" w:themeColor="text1"/>
           <w:sz w:val="28"/>
           <w:szCs w:val="28"/>
-          <w:lang w:val="fr-FR"/>
-        </w:rPr>
-      </w:pPr>
-      <w:r>
-        <w:rPr>
-          <w:rFonts w:ascii="Gill Sans MT" w:eastAsia="Gill Sans MT" w:hAnsi="Gill Sans MT" w:cs="Gill Sans MT"/>
+        </w:rPr>
+      </w:pPr>
+      <w:r>
+        <w:rPr>
+          <w:rFonts w:ascii="Gill Sans MT" w:hAnsi="Gill Sans MT" w:eastAsia="Gill Sans MT" w:cs="Gill Sans MT"/>
           <w:i/>
           <w:iCs/>
           <w:color w:val="000000" w:themeColor="text1"/>
           <w:sz w:val="28"/>
           <w:szCs w:val="28"/>
-          <w:lang w:val="fr-FR"/>
         </w:rPr>
         <w:t xml:space="preserve">   </w:t>
       </w:r>
@@ -1102,11 +832,10 @@
       <w:pPr>
         <w:spacing w:after="200" w:line="276" w:lineRule="auto"/>
         <w:rPr>
-          <w:rFonts w:ascii="Calibri" w:eastAsia="Calibri" w:hAnsi="Calibri" w:cs="Calibri"/>
+          <w:rFonts w:ascii="Calibri" w:hAnsi="Calibri" w:eastAsia="Calibri" w:cs="Calibri"/>
           <w:color w:val="000000" w:themeColor="text1"/>
           <w:sz w:val="22"/>
           <w:szCs w:val="22"/>
-          <w:lang w:val="fr-FR"/>
         </w:rPr>
       </w:pPr>
     </w:p>
@@ -1117,24 +846,14 @@
           <w:tab w:val="right" w:pos="9072"/>
         </w:tabs>
         <w:spacing w:after="0" w:line="240" w:lineRule="auto"/>
-        <w:rPr>
-          <w:lang w:val="fr-FR"/>
-        </w:rPr>
-      </w:pPr>
-    </w:p>
-    <w:p>
-      <w:pPr>
-        <w:rPr>
-          <w:lang w:val="fr-FR"/>
-        </w:rPr>
-      </w:pPr>
-    </w:p>
+      </w:pPr>
+    </w:p>
+    <w:p/>
     <w:sectPr>
       <w:headerReference w:type="default" r:id="rId8"/>
       <w:footerReference w:type="default" r:id="rId9"/>
       <w:pgSz w:w="11907" w:h="16839"/>
       <w:pgMar w:top="1417" w:right="709" w:bottom="1417" w:left="1417" w:header="720" w:footer="720" w:gutter="0"/>
-      <w:cols w:space="720"/>
       <w:docGrid w:linePitch="360"/>
     </w:sectPr>
   </w:body>
@@ -1167,11 +886,11 @@
 </file>
 
 <file path=word/footer1.xml><?xml version="1.0" encoding="utf-8"?>
-<w:ftr xmlns:wpc="http://schemas.microsoft.com/office/word/2010/wordprocessingCanvas" xmlns:cx="http://schemas.microsoft.com/office/drawing/2014/chartex" xmlns:cx1="http://schemas.microsoft.com/office/drawing/2015/9/8/chartex" xmlns:cx2="http://schemas.microsoft.com/office/drawing/2015/10/21/chartex" xmlns:cx3="http://schemas.microsoft.com/office/drawing/2016/5/9/chartex" xmlns:cx4="http://schemas.microsoft.com/office/drawing/2016/5/10/chartex" xmlns:cx5="http://schemas.microsoft.com/office/drawing/2016/5/11/chartex" xmlns:cx6="http://schemas.microsoft.com/office/drawing/2016/5/12/chartex" xmlns:cx7="http://schemas.microsoft.com/office/drawing/2016/5/13/chartex" xmlns:cx8="http://schemas.microsoft.com/office/drawing/2016/5/14/chartex" xmlns:mc="http://schemas.openxmlformats.org/markup-compatibility/2006" xmlns:aink="http://schemas.microsoft.com/office/drawing/2016/ink" xmlns:am3d="http://schemas.microsoft.com/office/drawing/2017/model3d" xmlns:o="urn:schemas-microsoft-com:office:office" xmlns:oel="http://schemas.microsoft.com/office/2019/extlst" xmlns:r="http://schemas.openxmlformats.org/officeDocument/2006/relationships" xmlns:m="http://schemas.openxmlformats.org/officeDocument/2006/math" xmlns:v="urn:schemas-microsoft-com:vml" xmlns:wp14="http://schemas.microsoft.com/office/word/2010/wordprocessingDrawing" xmlns:wp="http://schemas.openxmlformats.org/drawingml/2006/wordprocessingDrawing" xmlns:w10="urn:schemas-microsoft-com:office:word" xmlns:w="http://schemas.openxmlformats.org/wordprocessingml/2006/main" xmlns:w14="http://schemas.microsoft.com/office/word/2010/wordml" xmlns:w15="http://schemas.microsoft.com/office/word/2012/wordml" xmlns:w16cex="http://schemas.microsoft.com/office/word/2018/wordml/cex" xmlns:w16cid="http://schemas.microsoft.com/office/word/2016/wordml/cid" xmlns:w16="http://schemas.microsoft.com/office/word/2018/wordml" xmlns:w16du="http://schemas.microsoft.com/office/word/2023/wordml/word16du" xmlns:w16sdtdh="http://schemas.microsoft.com/office/word/2020/wordml/sdtdatahash" xmlns:w16sdtfl="http://schemas.microsoft.com/office/word/2024/wordml/sdtformatlock" xmlns:w16se="http://schemas.microsoft.com/office/word/2015/wordml/symex" xmlns:wpg="http://schemas.microsoft.com/office/word/2010/wordprocessingGroup" xmlns:wpi="http://schemas.microsoft.com/office/word/2010/wordprocessingInk" xmlns:wne="http://schemas.microsoft.com/office/word/2006/wordml" xmlns:wps="http://schemas.microsoft.com/office/word/2010/wordprocessingShape" mc:Ignorable="w14 w15 w16se w16cid w16 w16cex w16sdtdh w16sdtfl w16du wp14">
+<w:ftr xmlns:wpc="http://schemas.microsoft.com/office/word/2010/wordprocessingCanvas" xmlns:mc="http://schemas.openxmlformats.org/markup-compatibility/2006" xmlns:o="urn:schemas-microsoft-com:office:office" xmlns:r="http://schemas.openxmlformats.org/officeDocument/2006/relationships" xmlns:m="http://schemas.openxmlformats.org/officeDocument/2006/math" xmlns:v="urn:schemas-microsoft-com:vml" xmlns:wp14="http://schemas.microsoft.com/office/word/2010/wordprocessingDrawing" xmlns:wp="http://schemas.openxmlformats.org/drawingml/2006/wordprocessingDrawing" xmlns:w10="urn:schemas-microsoft-com:office:word" xmlns:w="http://schemas.openxmlformats.org/wordprocessingml/2006/main" xmlns:w14="http://schemas.microsoft.com/office/word/2010/wordml" xmlns:w15="http://schemas.microsoft.com/office/word/2012/wordml" xmlns:w16se="http://schemas.microsoft.com/office/word/2015/wordml/symex" xmlns:w16cid="http://schemas.microsoft.com/office/word/2016/wordml/cid" xmlns:w16="http://schemas.microsoft.com/office/word/2018/wordml" xmlns:w16cex="http://schemas.microsoft.com/office/word/2018/wordml/cex" xmlns:w16sdtdh="http://schemas.microsoft.com/office/word/2020/wordml/sdtdatahash" xmlns:wne="http://schemas.microsoft.com/office/word/2006/wordml" xmlns:wpg="http://schemas.microsoft.com/office/word/2010/wordprocessingGroup" xmlns:wps="http://schemas.microsoft.com/office/word/2010/wordprocessingShape">
   <w:tbl>
     <w:tblPr>
       <w:tblW w:w="0" w:type="auto"/>
-      <w:tblLook w:val="06A0" w:firstRow="1" w:lastRow="0" w:firstColumn="1" w:lastColumn="0" w:noHBand="1" w:noVBand="1"/>
+      <w:tblLook w:firstRow="1" w:firstColumn="1" w:noHBand="1" w:noVBand="1"/>
     </w:tblPr>
     <w:tblGrid>
       <w:gridCol w:w="3260"/>
@@ -1227,20 +946,18 @@
       </w:tabs>
       <w:jc w:val="center"/>
       <w:rPr>
-        <w:rFonts w:ascii="Calibri" w:eastAsia="Calibri" w:hAnsi="Calibri" w:cs="Calibri"/>
+        <w:rFonts w:ascii="Calibri" w:hAnsi="Calibri" w:eastAsia="Calibri" w:cs="Calibri"/>
         <w:color w:val="000000" w:themeColor="text1"/>
         <w:sz w:val="20"/>
         <w:szCs w:val="20"/>
-        <w:lang w:val="fr-FR"/>
       </w:rPr>
     </w:pPr>
     <w:r>
       <w:rPr>
-        <w:rFonts w:ascii="Calibri" w:eastAsia="Calibri" w:hAnsi="Calibri" w:cs="Calibri"/>
+        <w:rFonts w:ascii="Calibri" w:hAnsi="Calibri" w:eastAsia="Calibri" w:cs="Calibri"/>
         <w:color w:val="000000" w:themeColor="text1"/>
         <w:sz w:val="20"/>
         <w:szCs w:val="20"/>
-        <w:lang w:val="fr-FR"/>
       </w:rPr>
       <w:t xml:space="preserve">Cité des Métiers et des Compétences – Béni Mellal-Khénifra </w:t>
     </w:r>
@@ -1254,20 +971,18 @@
       </w:tabs>
       <w:jc w:val="center"/>
       <w:rPr>
-        <w:rFonts w:ascii="Calibri" w:eastAsia="Calibri" w:hAnsi="Calibri" w:cs="Calibri"/>
+        <w:rFonts w:ascii="Calibri" w:hAnsi="Calibri" w:eastAsia="Calibri" w:cs="Calibri"/>
         <w:color w:val="000000" w:themeColor="text1"/>
         <w:sz w:val="20"/>
         <w:szCs w:val="20"/>
-        <w:lang w:val="fr-FR"/>
       </w:rPr>
     </w:pPr>
     <w:r>
       <w:rPr>
-        <w:rFonts w:ascii="Calibri" w:eastAsia="Calibri" w:hAnsi="Calibri" w:cs="Calibri"/>
+        <w:rFonts w:ascii="Calibri" w:hAnsi="Calibri" w:eastAsia="Calibri" w:cs="Calibri"/>
         <w:color w:val="000000" w:themeColor="text1"/>
         <w:sz w:val="20"/>
         <w:szCs w:val="20"/>
-        <w:lang w:val="fr-FR"/>
       </w:rPr>
       <w:t>Zone Agropole – 20340. Béni Mellal</w:t>
     </w:r>
@@ -1281,18 +996,16 @@
       <w:spacing w:after="0" w:line="240" w:lineRule="auto"/>
       <w:jc w:val="center"/>
       <w:rPr>
-        <w:rFonts w:ascii="Calibri" w:eastAsia="Calibri" w:hAnsi="Calibri" w:cs="Calibri"/>
+        <w:rFonts w:ascii="Calibri" w:hAnsi="Calibri" w:eastAsia="Calibri" w:cs="Calibri"/>
         <w:color w:val="000000" w:themeColor="text1"/>
         <w:sz w:val="20"/>
         <w:szCs w:val="20"/>
-        <w:lang w:val="fr-FR"/>
       </w:rPr>
     </w:pPr>
     <w:hyperlink r:id="rId1">
       <w:r>
         <w:rPr>
           <w:rStyle w:val="Lienhypertexte"/>
-          <w:lang w:val="fr-FR"/>
         </w:rPr>
         <w:t>www.cmc.ac.ma</w:t>
       </w:r>
@@ -1307,20 +1020,16 @@
       <w:spacing w:after="0" w:line="240" w:lineRule="auto"/>
       <w:jc w:val="center"/>
       <w:rPr>
-        <w:rFonts w:ascii="Calibri" w:eastAsia="Calibri" w:hAnsi="Calibri" w:cs="Calibri"/>
+        <w:rFonts w:ascii="Calibri" w:hAnsi="Calibri" w:eastAsia="Calibri" w:cs="Calibri"/>
         <w:color w:val="000000" w:themeColor="text1"/>
         <w:sz w:val="20"/>
         <w:szCs w:val="20"/>
-        <w:lang w:val="fr-FR"/>
       </w:rPr>
     </w:pPr>
   </w:p>
   <w:p>
     <w:pPr>
       <w:pStyle w:val="Pieddepage"/>
-      <w:rPr>
-        <w:lang w:val="fr-FR"/>
-      </w:rPr>
     </w:pPr>
   </w:p>
 </w:ftr>
@@ -1352,11 +1061,11 @@
 </file>
 
 <file path=word/header1.xml><?xml version="1.0" encoding="utf-8"?>
-<w:hdr xmlns:wpc="http://schemas.microsoft.com/office/word/2010/wordprocessingCanvas" xmlns:cx="http://schemas.microsoft.com/office/drawing/2014/chartex" xmlns:cx1="http://schemas.microsoft.com/office/drawing/2015/9/8/chartex" xmlns:cx2="http://schemas.microsoft.com/office/drawing/2015/10/21/chartex" xmlns:cx3="http://schemas.microsoft.com/office/drawing/2016/5/9/chartex" xmlns:cx4="http://schemas.microsoft.com/office/drawing/2016/5/10/chartex" xmlns:cx5="http://schemas.microsoft.com/office/drawing/2016/5/11/chartex" xmlns:cx6="http://schemas.microsoft.com/office/drawing/2016/5/12/chartex" xmlns:cx7="http://schemas.microsoft.com/office/drawing/2016/5/13/chartex" xmlns:cx8="http://schemas.microsoft.com/office/drawing/2016/5/14/chartex" xmlns:mc="http://schemas.openxmlformats.org/markup-compatibility/2006" xmlns:aink="http://schemas.microsoft.com/office/drawing/2016/ink" xmlns:am3d="http://schemas.microsoft.com/office/drawing/2017/model3d" xmlns:o="urn:schemas-microsoft-com:office:office" xmlns:oel="http://schemas.microsoft.com/office/2019/extlst" xmlns:r="http://schemas.openxmlformats.org/officeDocument/2006/relationships" xmlns:m="http://schemas.openxmlformats.org/officeDocument/2006/math" xmlns:v="urn:schemas-microsoft-com:vml" xmlns:wp14="http://schemas.microsoft.com/office/word/2010/wordprocessingDrawing" xmlns:wp="http://schemas.openxmlformats.org/drawingml/2006/wordprocessingDrawing" xmlns:w10="urn:schemas-microsoft-com:office:word" xmlns:w="http://schemas.openxmlformats.org/wordprocessingml/2006/main" xmlns:w14="http://schemas.microsoft.com/office/word/2010/wordml" xmlns:w15="http://schemas.microsoft.com/office/word/2012/wordml" xmlns:w16cex="http://schemas.microsoft.com/office/word/2018/wordml/cex" xmlns:w16cid="http://schemas.microsoft.com/office/word/2016/wordml/cid" xmlns:w16="http://schemas.microsoft.com/office/word/2018/wordml" xmlns:w16du="http://schemas.microsoft.com/office/word/2023/wordml/word16du" xmlns:w16sdtdh="http://schemas.microsoft.com/office/word/2020/wordml/sdtdatahash" xmlns:w16sdtfl="http://schemas.microsoft.com/office/word/2024/wordml/sdtformatlock" xmlns:w16se="http://schemas.microsoft.com/office/word/2015/wordml/symex" xmlns:wpg="http://schemas.microsoft.com/office/word/2010/wordprocessingGroup" xmlns:wpi="http://schemas.microsoft.com/office/word/2010/wordprocessingInk" xmlns:wne="http://schemas.microsoft.com/office/word/2006/wordml" xmlns:wps="http://schemas.microsoft.com/office/word/2010/wordprocessingShape" mc:Ignorable="w14 w15 w16se w16cid w16 w16cex w16sdtdh w16sdtfl w16du wp14">
+<w:hdr xmlns:wpc="http://schemas.microsoft.com/office/word/2010/wordprocessingCanvas" xmlns:mc="http://schemas.openxmlformats.org/markup-compatibility/2006" xmlns:o="urn:schemas-microsoft-com:office:office" xmlns:r="http://schemas.openxmlformats.org/officeDocument/2006/relationships" xmlns:m="http://schemas.openxmlformats.org/officeDocument/2006/math" xmlns:v="urn:schemas-microsoft-com:vml" xmlns:wp14="http://schemas.microsoft.com/office/word/2010/wordprocessingDrawing" xmlns:wp="http://schemas.openxmlformats.org/drawingml/2006/wordprocessingDrawing" xmlns:w10="urn:schemas-microsoft-com:office:word" xmlns:w="http://schemas.openxmlformats.org/wordprocessingml/2006/main" xmlns:w14="http://schemas.microsoft.com/office/word/2010/wordml" xmlns:w15="http://schemas.microsoft.com/office/word/2012/wordml" xmlns:w16se="http://schemas.microsoft.com/office/word/2015/wordml/symex" xmlns:w16cid="http://schemas.microsoft.com/office/word/2016/wordml/cid" xmlns:w16="http://schemas.microsoft.com/office/word/2018/wordml" xmlns:w16cex="http://schemas.microsoft.com/office/word/2018/wordml/cex" xmlns:w16sdtdh="http://schemas.microsoft.com/office/word/2020/wordml/sdtdatahash" xmlns:wne="http://schemas.microsoft.com/office/word/2006/wordml" xmlns:wpg="http://schemas.microsoft.com/office/word/2010/wordprocessingGroup" xmlns:wps="http://schemas.microsoft.com/office/word/2010/wordprocessingShape">
   <w:tbl>
     <w:tblPr>
       <w:tblW w:w="6520" w:type="dxa"/>
-      <w:tblLook w:val="06A0" w:firstRow="1" w:lastRow="0" w:firstColumn="1" w:lastColumn="0" w:noHBand="1" w:noVBand="1"/>
+      <w:tblLook w:firstRow="1" w:firstColumn="1" w:noHBand="1" w:noVBand="1"/>
     </w:tblPr>
     <w:tblGrid>
       <w:gridCol w:w="3260"/>

</xml_diff>